<commit_message>
Ajustar ancho de tablas al margen de página en documentos VALO
Co-Authored-By: Claude Opus 5.5 <noreply@anthropic.com>
Claude-Session: https://claude.ai/code/session_01WxCVvi9WUJZoa4dYVmts3j
</commit_message>
<xml_diff>
--- a/respuestas_VALO/Diseño Archivo Créditos VALO - RESPONDIDO.docx
+++ b/respuestas_VALO/Diseño Archivo Créditos VALO - RESPONDIDO.docx
@@ -421,7 +421,7 @@
     <w:tbl>
       <w:tblPr>
         <w:tblW w:w="7644" w:type="dxa"/>
-        <w:tblInd w:w="-577" w:type="dxa"/>
+        <w:tblInd w:w="0" w:type="dxa"/>
         <w:tblLayout w:type="fixed"/>
         <w:tblCellMar>
           <w:left w:w="0" w:type="dxa"/>
@@ -847,8 +847,8 @@
     </w:p>
     <w:tbl>
       <w:tblPr>
-        <w:tblW w:w="9356" w:type="dxa"/>
-        <w:tblInd w:w="-572" w:type="dxa"/>
+        <w:tblW w:w="9355" w:type="dxa"/>
+        <w:tblInd w:w="0" w:type="dxa"/>
         <w:tblCellMar>
           <w:left w:w="70" w:type="dxa"/>
           <w:right w:w="70" w:type="dxa"/>
@@ -2589,8 +2589,8 @@
     </w:p>
     <w:tbl>
       <w:tblPr>
-        <w:tblW w:w="10314" w:type="dxa"/>
-        <w:tblInd w:w="-572" w:type="dxa"/>
+        <w:tblW w:w="9355" w:type="dxa"/>
+        <w:tblInd w:w="0" w:type="dxa"/>
         <w:tblCellMar>
           <w:left w:w="70" w:type="dxa"/>
           <w:right w:w="70" w:type="dxa"/>
@@ -2598,13 +2598,13 @@
         <w:tblLook w:val="04A0" w:firstRow="1" w:lastRow="0" w:firstColumn="1" w:lastColumn="0" w:noHBand="0" w:noVBand="1"/>
       </w:tblPr>
       <w:tblGrid>
-        <w:gridCol w:w="323"/>
-        <w:gridCol w:w="1860"/>
-        <w:gridCol w:w="1320"/>
-        <w:gridCol w:w="1125"/>
-        <w:gridCol w:w="795"/>
-        <w:gridCol w:w="906"/>
-        <w:gridCol w:w="3985"/>
+        <w:gridCol w:w="440"/>
+        <w:gridCol w:w="1687"/>
+        <w:gridCol w:w="1197"/>
+        <w:gridCol w:w="1020"/>
+        <w:gridCol w:w="721"/>
+        <w:gridCol w:w="822"/>
+        <w:gridCol w:w="3467"/>
       </w:tblGrid>
       <w:tr>
         <w:trPr>
@@ -2613,7 +2613,7 @@
         </w:trPr>
         <w:tc>
           <w:tcPr>
-            <w:tcW w:w="323" w:type="dxa"/>
+            <w:tcW w:w="440" w:type="dxa"/>
             <w:tcBorders>
               <w:top w:val="single" w:sz="4" w:space="0" w:color="auto"/>
               <w:left w:val="single" w:sz="4" w:space="0" w:color="auto"/>
@@ -2654,7 +2654,7 @@
         </w:tc>
         <w:tc>
           <w:tcPr>
-            <w:tcW w:w="1860" w:type="dxa"/>
+            <w:tcW w:w="1687" w:type="dxa"/>
             <w:tcBorders>
               <w:top w:val="single" w:sz="4" w:space="0" w:color="auto"/>
               <w:left w:val="nil"/>
@@ -2696,7 +2696,7 @@
         </w:tc>
         <w:tc>
           <w:tcPr>
-            <w:tcW w:w="1320" w:type="dxa"/>
+            <w:tcW w:w="1197" w:type="dxa"/>
             <w:tcBorders>
               <w:top w:val="single" w:sz="4" w:space="0" w:color="auto"/>
               <w:left w:val="nil"/>
@@ -2738,7 +2738,7 @@
         </w:tc>
         <w:tc>
           <w:tcPr>
-            <w:tcW w:w="1125" w:type="dxa"/>
+            <w:tcW w:w="1020" w:type="dxa"/>
             <w:tcBorders>
               <w:top w:val="single" w:sz="4" w:space="0" w:color="auto"/>
               <w:left w:val="nil"/>
@@ -2780,7 +2780,7 @@
         </w:tc>
         <w:tc>
           <w:tcPr>
-            <w:tcW w:w="795" w:type="dxa"/>
+            <w:tcW w:w="721" w:type="dxa"/>
             <w:tcBorders>
               <w:top w:val="single" w:sz="4" w:space="0" w:color="auto"/>
               <w:left w:val="nil"/>
@@ -2821,7 +2821,7 @@
         </w:tc>
         <w:tc>
           <w:tcPr>
-            <w:tcW w:w="906" w:type="dxa"/>
+            <w:tcW w:w="822" w:type="dxa"/>
             <w:tcBorders>
               <w:top w:val="single" w:sz="4" w:space="0" w:color="auto"/>
               <w:left w:val="nil"/>
@@ -2862,7 +2862,7 @@
         </w:tc>
         <w:tc>
           <w:tcPr>
-            <w:tcW w:w="3985" w:type="dxa"/>
+            <w:tcW w:w="3467" w:type="dxa"/>
             <w:tcBorders>
               <w:top w:val="single" w:sz="4" w:space="0" w:color="auto"/>
               <w:left w:val="nil"/>
@@ -2909,7 +2909,7 @@
         </w:trPr>
         <w:tc>
           <w:tcPr>
-            <w:tcW w:w="323" w:type="dxa"/>
+            <w:tcW w:w="440" w:type="dxa"/>
             <w:tcBorders>
               <w:top w:val="nil"/>
               <w:left w:val="single" w:sz="4" w:space="0" w:color="auto"/>
@@ -2946,7 +2946,7 @@
         </w:tc>
         <w:tc>
           <w:tcPr>
-            <w:tcW w:w="1860" w:type="dxa"/>
+            <w:tcW w:w="1687" w:type="dxa"/>
             <w:tcBorders>
               <w:top w:val="nil"/>
               <w:left w:val="nil"/>
@@ -2982,7 +2982,7 @@
         </w:tc>
         <w:tc>
           <w:tcPr>
-            <w:tcW w:w="1320" w:type="dxa"/>
+            <w:tcW w:w="1197" w:type="dxa"/>
             <w:tcBorders>
               <w:top w:val="nil"/>
               <w:left w:val="nil"/>
@@ -3018,7 +3018,7 @@
         </w:tc>
         <w:tc>
           <w:tcPr>
-            <w:tcW w:w="1125" w:type="dxa"/>
+            <w:tcW w:w="1020" w:type="dxa"/>
             <w:tcBorders>
               <w:top w:val="nil"/>
               <w:left w:val="nil"/>
@@ -3054,7 +3054,7 @@
         </w:tc>
         <w:tc>
           <w:tcPr>
-            <w:tcW w:w="795" w:type="dxa"/>
+            <w:tcW w:w="721" w:type="dxa"/>
             <w:tcBorders>
               <w:top w:val="nil"/>
               <w:left w:val="nil"/>
@@ -3090,7 +3090,7 @@
         </w:tc>
         <w:tc>
           <w:tcPr>
-            <w:tcW w:w="906" w:type="dxa"/>
+            <w:tcW w:w="822" w:type="dxa"/>
             <w:tcBorders>
               <w:top w:val="nil"/>
               <w:left w:val="nil"/>
@@ -3126,7 +3126,7 @@
         </w:tc>
         <w:tc>
           <w:tcPr>
-            <w:tcW w:w="3985" w:type="dxa"/>
+            <w:tcW w:w="3467" w:type="dxa"/>
             <w:tcBorders>
               <w:top w:val="nil"/>
               <w:left w:val="nil"/>
@@ -3167,7 +3167,7 @@
         </w:trPr>
         <w:tc>
           <w:tcPr>
-            <w:tcW w:w="323" w:type="dxa"/>
+            <w:tcW w:w="440" w:type="dxa"/>
             <w:tcBorders>
               <w:top w:val="nil"/>
               <w:left w:val="single" w:sz="4" w:space="0" w:color="auto"/>
@@ -3204,7 +3204,7 @@
         </w:tc>
         <w:tc>
           <w:tcPr>
-            <w:tcW w:w="1860" w:type="dxa"/>
+            <w:tcW w:w="1687" w:type="dxa"/>
             <w:tcBorders>
               <w:top w:val="nil"/>
               <w:left w:val="nil"/>
@@ -3240,7 +3240,7 @@
         </w:tc>
         <w:tc>
           <w:tcPr>
-            <w:tcW w:w="1320" w:type="dxa"/>
+            <w:tcW w:w="1197" w:type="dxa"/>
             <w:tcBorders>
               <w:top w:val="nil"/>
               <w:left w:val="nil"/>
@@ -3276,7 +3276,7 @@
         </w:tc>
         <w:tc>
           <w:tcPr>
-            <w:tcW w:w="1125" w:type="dxa"/>
+            <w:tcW w:w="1020" w:type="dxa"/>
             <w:tcBorders>
               <w:top w:val="nil"/>
               <w:left w:val="nil"/>
@@ -3312,7 +3312,7 @@
         </w:tc>
         <w:tc>
           <w:tcPr>
-            <w:tcW w:w="795" w:type="dxa"/>
+            <w:tcW w:w="721" w:type="dxa"/>
             <w:tcBorders>
               <w:top w:val="nil"/>
               <w:left w:val="nil"/>
@@ -3348,7 +3348,7 @@
         </w:tc>
         <w:tc>
           <w:tcPr>
-            <w:tcW w:w="906" w:type="dxa"/>
+            <w:tcW w:w="822" w:type="dxa"/>
             <w:tcBorders>
               <w:top w:val="nil"/>
               <w:left w:val="nil"/>
@@ -3384,7 +3384,7 @@
         </w:tc>
         <w:tc>
           <w:tcPr>
-            <w:tcW w:w="3985" w:type="dxa"/>
+            <w:tcW w:w="3467" w:type="dxa"/>
             <w:tcBorders>
               <w:top w:val="nil"/>
               <w:left w:val="nil"/>
@@ -3426,7 +3426,7 @@
         </w:trPr>
         <w:tc>
           <w:tcPr>
-            <w:tcW w:w="323" w:type="dxa"/>
+            <w:tcW w:w="440" w:type="dxa"/>
             <w:tcBorders>
               <w:top w:val="nil"/>
               <w:left w:val="single" w:sz="4" w:space="0" w:color="auto"/>
@@ -3463,7 +3463,7 @@
         </w:tc>
         <w:tc>
           <w:tcPr>
-            <w:tcW w:w="1860" w:type="dxa"/>
+            <w:tcW w:w="1687" w:type="dxa"/>
             <w:vMerge w:val="restart"/>
             <w:tcBorders>
               <w:top w:val="nil"/>
@@ -3500,7 +3500,7 @@
         </w:tc>
         <w:tc>
           <w:tcPr>
-            <w:tcW w:w="1320" w:type="dxa"/>
+            <w:tcW w:w="1197" w:type="dxa"/>
             <w:tcBorders>
               <w:top w:val="nil"/>
               <w:left w:val="nil"/>
@@ -3537,7 +3537,7 @@
         </w:tc>
         <w:tc>
           <w:tcPr>
-            <w:tcW w:w="1125" w:type="dxa"/>
+            <w:tcW w:w="1020" w:type="dxa"/>
             <w:vMerge w:val="restart"/>
             <w:tcBorders>
               <w:top w:val="nil"/>
@@ -3574,7 +3574,7 @@
         </w:tc>
         <w:tc>
           <w:tcPr>
-            <w:tcW w:w="795" w:type="dxa"/>
+            <w:tcW w:w="721" w:type="dxa"/>
             <w:vMerge w:val="restart"/>
             <w:tcBorders>
               <w:top w:val="nil"/>
@@ -3611,7 +3611,7 @@
         </w:tc>
         <w:tc>
           <w:tcPr>
-            <w:tcW w:w="906" w:type="dxa"/>
+            <w:tcW w:w="822" w:type="dxa"/>
             <w:vMerge w:val="restart"/>
             <w:tcBorders>
               <w:top w:val="nil"/>
@@ -3648,7 +3648,7 @@
         </w:tc>
         <w:tc>
           <w:tcPr>
-            <w:tcW w:w="3985" w:type="dxa"/>
+            <w:tcW w:w="3467" w:type="dxa"/>
             <w:tcBorders>
               <w:top w:val="nil"/>
               <w:left w:val="nil"/>
@@ -3689,7 +3689,7 @@
         </w:trPr>
         <w:tc>
           <w:tcPr>
-            <w:tcW w:w="323" w:type="dxa"/>
+            <w:tcW w:w="440" w:type="dxa"/>
             <w:tcBorders>
               <w:top w:val="nil"/>
               <w:left w:val="single" w:sz="4" w:space="0" w:color="auto"/>
@@ -3727,7 +3727,7 @@
         </w:tc>
         <w:tc>
           <w:tcPr>
-            <w:tcW w:w="1860" w:type="dxa"/>
+            <w:tcW w:w="1687" w:type="dxa"/>
             <w:vMerge/>
             <w:tcBorders>
               <w:top w:val="nil"/>
@@ -3754,7 +3754,7 @@
         </w:tc>
         <w:tc>
           <w:tcPr>
-            <w:tcW w:w="1320" w:type="dxa"/>
+            <w:tcW w:w="1197" w:type="dxa"/>
             <w:tcBorders>
               <w:top w:val="nil"/>
               <w:left w:val="nil"/>
@@ -3791,7 +3791,7 @@
         </w:tc>
         <w:tc>
           <w:tcPr>
-            <w:tcW w:w="1125" w:type="dxa"/>
+            <w:tcW w:w="1020" w:type="dxa"/>
             <w:vMerge/>
             <w:tcBorders>
               <w:top w:val="nil"/>
@@ -3818,7 +3818,7 @@
         </w:tc>
         <w:tc>
           <w:tcPr>
-            <w:tcW w:w="795" w:type="dxa"/>
+            <w:tcW w:w="721" w:type="dxa"/>
             <w:vMerge/>
             <w:tcBorders>
               <w:top w:val="nil"/>
@@ -3845,7 +3845,7 @@
         </w:tc>
         <w:tc>
           <w:tcPr>
-            <w:tcW w:w="906" w:type="dxa"/>
+            <w:tcW w:w="822" w:type="dxa"/>
             <w:vMerge/>
             <w:tcBorders>
               <w:top w:val="nil"/>
@@ -3872,7 +3872,7 @@
         </w:tc>
         <w:tc>
           <w:tcPr>
-            <w:tcW w:w="3985" w:type="dxa"/>
+            <w:tcW w:w="3467" w:type="dxa"/>
             <w:tcBorders>
               <w:top w:val="nil"/>
               <w:left w:val="nil"/>
@@ -3915,7 +3915,7 @@
         </w:trPr>
         <w:tc>
           <w:tcPr>
-            <w:tcW w:w="323" w:type="dxa"/>
+            <w:tcW w:w="440" w:type="dxa"/>
             <w:tcBorders>
               <w:top w:val="nil"/>
               <w:left w:val="single" w:sz="4" w:space="0" w:color="auto"/>
@@ -3953,7 +3953,7 @@
         </w:tc>
         <w:tc>
           <w:tcPr>
-            <w:tcW w:w="1860" w:type="dxa"/>
+            <w:tcW w:w="1687" w:type="dxa"/>
             <w:vMerge/>
             <w:tcBorders>
               <w:top w:val="nil"/>
@@ -3980,7 +3980,7 @@
         </w:tc>
         <w:tc>
           <w:tcPr>
-            <w:tcW w:w="1320" w:type="dxa"/>
+            <w:tcW w:w="1197" w:type="dxa"/>
             <w:tcBorders>
               <w:top w:val="nil"/>
               <w:left w:val="nil"/>
@@ -4017,7 +4017,7 @@
         </w:tc>
         <w:tc>
           <w:tcPr>
-            <w:tcW w:w="1125" w:type="dxa"/>
+            <w:tcW w:w="1020" w:type="dxa"/>
             <w:vMerge/>
             <w:tcBorders>
               <w:top w:val="nil"/>
@@ -4044,7 +4044,7 @@
         </w:tc>
         <w:tc>
           <w:tcPr>
-            <w:tcW w:w="795" w:type="dxa"/>
+            <w:tcW w:w="721" w:type="dxa"/>
             <w:vMerge/>
             <w:tcBorders>
               <w:top w:val="nil"/>
@@ -4071,7 +4071,7 @@
         </w:tc>
         <w:tc>
           <w:tcPr>
-            <w:tcW w:w="906" w:type="dxa"/>
+            <w:tcW w:w="822" w:type="dxa"/>
             <w:vMerge/>
             <w:tcBorders>
               <w:top w:val="nil"/>
@@ -4098,7 +4098,7 @@
         </w:tc>
         <w:tc>
           <w:tcPr>
-            <w:tcW w:w="3985" w:type="dxa"/>
+            <w:tcW w:w="3467" w:type="dxa"/>
             <w:tcBorders>
               <w:top w:val="nil"/>
               <w:left w:val="nil"/>
@@ -4139,7 +4139,7 @@
         </w:trPr>
         <w:tc>
           <w:tcPr>
-            <w:tcW w:w="323" w:type="dxa"/>
+            <w:tcW w:w="440" w:type="dxa"/>
             <w:tcBorders>
               <w:top w:val="nil"/>
               <w:left w:val="single" w:sz="4" w:space="0" w:color="auto"/>
@@ -4177,7 +4177,7 @@
         </w:tc>
         <w:tc>
           <w:tcPr>
-            <w:tcW w:w="1860" w:type="dxa"/>
+            <w:tcW w:w="1687" w:type="dxa"/>
             <w:vMerge/>
             <w:tcBorders>
               <w:top w:val="nil"/>
@@ -4204,7 +4204,7 @@
         </w:tc>
         <w:tc>
           <w:tcPr>
-            <w:tcW w:w="1320" w:type="dxa"/>
+            <w:tcW w:w="1197" w:type="dxa"/>
             <w:tcBorders>
               <w:top w:val="nil"/>
               <w:left w:val="nil"/>
@@ -4241,7 +4241,7 @@
         </w:tc>
         <w:tc>
           <w:tcPr>
-            <w:tcW w:w="1125" w:type="dxa"/>
+            <w:tcW w:w="1020" w:type="dxa"/>
             <w:vMerge/>
             <w:tcBorders>
               <w:top w:val="nil"/>
@@ -4268,7 +4268,7 @@
         </w:tc>
         <w:tc>
           <w:tcPr>
-            <w:tcW w:w="795" w:type="dxa"/>
+            <w:tcW w:w="721" w:type="dxa"/>
             <w:vMerge/>
             <w:tcBorders>
               <w:top w:val="nil"/>
@@ -4295,7 +4295,7 @@
         </w:tc>
         <w:tc>
           <w:tcPr>
-            <w:tcW w:w="906" w:type="dxa"/>
+            <w:tcW w:w="822" w:type="dxa"/>
             <w:vMerge/>
             <w:tcBorders>
               <w:top w:val="nil"/>
@@ -4322,7 +4322,7 @@
         </w:tc>
         <w:tc>
           <w:tcPr>
-            <w:tcW w:w="3985" w:type="dxa"/>
+            <w:tcW w:w="3467" w:type="dxa"/>
             <w:tcBorders>
               <w:top w:val="nil"/>
               <w:left w:val="nil"/>
@@ -4363,7 +4363,7 @@
         </w:trPr>
         <w:tc>
           <w:tcPr>
-            <w:tcW w:w="323" w:type="dxa"/>
+            <w:tcW w:w="440" w:type="dxa"/>
             <w:tcBorders>
               <w:top w:val="nil"/>
               <w:left w:val="single" w:sz="4" w:space="0" w:color="auto"/>
@@ -4401,7 +4401,7 @@
         </w:tc>
         <w:tc>
           <w:tcPr>
-            <w:tcW w:w="1860" w:type="dxa"/>
+            <w:tcW w:w="1687" w:type="dxa"/>
             <w:vMerge/>
             <w:tcBorders>
               <w:top w:val="nil"/>
@@ -4428,7 +4428,7 @@
         </w:tc>
         <w:tc>
           <w:tcPr>
-            <w:tcW w:w="1320" w:type="dxa"/>
+            <w:tcW w:w="1197" w:type="dxa"/>
             <w:tcBorders>
               <w:top w:val="nil"/>
               <w:left w:val="nil"/>
@@ -4465,7 +4465,7 @@
         </w:tc>
         <w:tc>
           <w:tcPr>
-            <w:tcW w:w="1125" w:type="dxa"/>
+            <w:tcW w:w="1020" w:type="dxa"/>
             <w:vMerge/>
             <w:tcBorders>
               <w:top w:val="nil"/>
@@ -4492,7 +4492,7 @@
         </w:tc>
         <w:tc>
           <w:tcPr>
-            <w:tcW w:w="795" w:type="dxa"/>
+            <w:tcW w:w="721" w:type="dxa"/>
             <w:vMerge/>
             <w:tcBorders>
               <w:top w:val="nil"/>
@@ -4519,7 +4519,7 @@
         </w:tc>
         <w:tc>
           <w:tcPr>
-            <w:tcW w:w="906" w:type="dxa"/>
+            <w:tcW w:w="822" w:type="dxa"/>
             <w:vMerge/>
             <w:tcBorders>
               <w:top w:val="nil"/>
@@ -4546,7 +4546,7 @@
         </w:tc>
         <w:tc>
           <w:tcPr>
-            <w:tcW w:w="3985" w:type="dxa"/>
+            <w:tcW w:w="3467" w:type="dxa"/>
             <w:tcBorders>
               <w:top w:val="nil"/>
               <w:left w:val="nil"/>
@@ -4587,7 +4587,7 @@
         </w:trPr>
         <w:tc>
           <w:tcPr>
-            <w:tcW w:w="323" w:type="dxa"/>
+            <w:tcW w:w="440" w:type="dxa"/>
             <w:tcBorders>
               <w:top w:val="nil"/>
               <w:left w:val="single" w:sz="4" w:space="0" w:color="auto"/>
@@ -4625,7 +4625,7 @@
         </w:tc>
         <w:tc>
           <w:tcPr>
-            <w:tcW w:w="1860" w:type="dxa"/>
+            <w:tcW w:w="1687" w:type="dxa"/>
             <w:vMerge/>
             <w:tcBorders>
               <w:top w:val="nil"/>
@@ -4652,7 +4652,7 @@
         </w:tc>
         <w:tc>
           <w:tcPr>
-            <w:tcW w:w="1320" w:type="dxa"/>
+            <w:tcW w:w="1197" w:type="dxa"/>
             <w:tcBorders>
               <w:top w:val="nil"/>
               <w:left w:val="nil"/>
@@ -4689,7 +4689,7 @@
         </w:tc>
         <w:tc>
           <w:tcPr>
-            <w:tcW w:w="1125" w:type="dxa"/>
+            <w:tcW w:w="1020" w:type="dxa"/>
             <w:vMerge/>
             <w:tcBorders>
               <w:top w:val="nil"/>
@@ -4716,7 +4716,7 @@
         </w:tc>
         <w:tc>
           <w:tcPr>
-            <w:tcW w:w="795" w:type="dxa"/>
+            <w:tcW w:w="721" w:type="dxa"/>
             <w:vMerge/>
             <w:tcBorders>
               <w:top w:val="nil"/>
@@ -4743,7 +4743,7 @@
         </w:tc>
         <w:tc>
           <w:tcPr>
-            <w:tcW w:w="906" w:type="dxa"/>
+            <w:tcW w:w="822" w:type="dxa"/>
             <w:vMerge/>
             <w:tcBorders>
               <w:top w:val="nil"/>
@@ -4770,7 +4770,7 @@
         </w:tc>
         <w:tc>
           <w:tcPr>
-            <w:tcW w:w="3985" w:type="dxa"/>
+            <w:tcW w:w="3467" w:type="dxa"/>
             <w:tcBorders>
               <w:top w:val="nil"/>
               <w:left w:val="nil"/>
@@ -4811,7 +4811,7 @@
         </w:trPr>
         <w:tc>
           <w:tcPr>
-            <w:tcW w:w="323" w:type="dxa"/>
+            <w:tcW w:w="440" w:type="dxa"/>
             <w:tcBorders>
               <w:top w:val="nil"/>
               <w:left w:val="single" w:sz="4" w:space="0" w:color="auto"/>
@@ -4850,7 +4850,7 @@
         </w:tc>
         <w:tc>
           <w:tcPr>
-            <w:tcW w:w="1860" w:type="dxa"/>
+            <w:tcW w:w="1687" w:type="dxa"/>
             <w:vMerge/>
             <w:tcBorders>
               <w:top w:val="nil"/>
@@ -4877,7 +4877,7 @@
         </w:tc>
         <w:tc>
           <w:tcPr>
-            <w:tcW w:w="1320" w:type="dxa"/>
+            <w:tcW w:w="1197" w:type="dxa"/>
             <w:tcBorders>
               <w:top w:val="nil"/>
               <w:left w:val="nil"/>
@@ -4914,7 +4914,7 @@
         </w:tc>
         <w:tc>
           <w:tcPr>
-            <w:tcW w:w="1125" w:type="dxa"/>
+            <w:tcW w:w="1020" w:type="dxa"/>
             <w:vMerge/>
             <w:tcBorders>
               <w:top w:val="nil"/>
@@ -4941,7 +4941,7 @@
         </w:tc>
         <w:tc>
           <w:tcPr>
-            <w:tcW w:w="795" w:type="dxa"/>
+            <w:tcW w:w="721" w:type="dxa"/>
             <w:vMerge/>
             <w:tcBorders>
               <w:top w:val="nil"/>
@@ -4968,7 +4968,7 @@
         </w:tc>
         <w:tc>
           <w:tcPr>
-            <w:tcW w:w="906" w:type="dxa"/>
+            <w:tcW w:w="822" w:type="dxa"/>
             <w:vMerge/>
             <w:tcBorders>
               <w:top w:val="nil"/>
@@ -4995,7 +4995,7 @@
         </w:tc>
         <w:tc>
           <w:tcPr>
-            <w:tcW w:w="3985" w:type="dxa"/>
+            <w:tcW w:w="3467" w:type="dxa"/>
             <w:tcBorders>
               <w:top w:val="nil"/>
               <w:left w:val="nil"/>
@@ -5036,7 +5036,7 @@
         </w:trPr>
         <w:tc>
           <w:tcPr>
-            <w:tcW w:w="323" w:type="dxa"/>
+            <w:tcW w:w="440" w:type="dxa"/>
             <w:tcBorders>
               <w:top w:val="nil"/>
               <w:left w:val="single" w:sz="4" w:space="0" w:color="auto"/>
@@ -5075,7 +5075,7 @@
         </w:tc>
         <w:tc>
           <w:tcPr>
-            <w:tcW w:w="1860" w:type="dxa"/>
+            <w:tcW w:w="1687" w:type="dxa"/>
             <w:vMerge/>
             <w:tcBorders>
               <w:top w:val="nil"/>
@@ -5102,7 +5102,7 @@
         </w:tc>
         <w:tc>
           <w:tcPr>
-            <w:tcW w:w="1320" w:type="dxa"/>
+            <w:tcW w:w="1197" w:type="dxa"/>
             <w:tcBorders>
               <w:top w:val="nil"/>
               <w:left w:val="nil"/>
@@ -5139,7 +5139,7 @@
         </w:tc>
         <w:tc>
           <w:tcPr>
-            <w:tcW w:w="1125" w:type="dxa"/>
+            <w:tcW w:w="1020" w:type="dxa"/>
             <w:vMerge/>
             <w:tcBorders>
               <w:top w:val="nil"/>
@@ -5166,7 +5166,7 @@
         </w:tc>
         <w:tc>
           <w:tcPr>
-            <w:tcW w:w="795" w:type="dxa"/>
+            <w:tcW w:w="721" w:type="dxa"/>
             <w:vMerge/>
             <w:tcBorders>
               <w:top w:val="nil"/>
@@ -5193,7 +5193,7 @@
         </w:tc>
         <w:tc>
           <w:tcPr>
-            <w:tcW w:w="906" w:type="dxa"/>
+            <w:tcW w:w="822" w:type="dxa"/>
             <w:vMerge/>
             <w:tcBorders>
               <w:top w:val="nil"/>
@@ -5220,7 +5220,7 @@
         </w:tc>
         <w:tc>
           <w:tcPr>
-            <w:tcW w:w="3985" w:type="dxa"/>
+            <w:tcW w:w="3467" w:type="dxa"/>
             <w:tcBorders>
               <w:top w:val="nil"/>
               <w:left w:val="nil"/>
@@ -5261,7 +5261,7 @@
         </w:trPr>
         <w:tc>
           <w:tcPr>
-            <w:tcW w:w="323" w:type="dxa"/>
+            <w:tcW w:w="440" w:type="dxa"/>
             <w:tcBorders>
               <w:top w:val="nil"/>
               <w:left w:val="single" w:sz="4" w:space="0" w:color="auto"/>
@@ -5299,7 +5299,7 @@
         </w:tc>
         <w:tc>
           <w:tcPr>
-            <w:tcW w:w="1860" w:type="dxa"/>
+            <w:tcW w:w="1687" w:type="dxa"/>
             <w:vMerge/>
             <w:tcBorders>
               <w:top w:val="nil"/>
@@ -5326,7 +5326,7 @@
         </w:tc>
         <w:tc>
           <w:tcPr>
-            <w:tcW w:w="1320" w:type="dxa"/>
+            <w:tcW w:w="1197" w:type="dxa"/>
             <w:tcBorders>
               <w:top w:val="nil"/>
               <w:left w:val="nil"/>
@@ -5363,7 +5363,7 @@
         </w:tc>
         <w:tc>
           <w:tcPr>
-            <w:tcW w:w="1125" w:type="dxa"/>
+            <w:tcW w:w="1020" w:type="dxa"/>
             <w:vMerge/>
             <w:tcBorders>
               <w:top w:val="nil"/>
@@ -5390,7 +5390,7 @@
         </w:tc>
         <w:tc>
           <w:tcPr>
-            <w:tcW w:w="795" w:type="dxa"/>
+            <w:tcW w:w="721" w:type="dxa"/>
             <w:vMerge/>
             <w:tcBorders>
               <w:top w:val="nil"/>
@@ -5417,7 +5417,7 @@
         </w:tc>
         <w:tc>
           <w:tcPr>
-            <w:tcW w:w="906" w:type="dxa"/>
+            <w:tcW w:w="822" w:type="dxa"/>
             <w:vMerge/>
             <w:tcBorders>
               <w:top w:val="nil"/>
@@ -5444,7 +5444,7 @@
         </w:tc>
         <w:tc>
           <w:tcPr>
-            <w:tcW w:w="3985" w:type="dxa"/>
+            <w:tcW w:w="3467" w:type="dxa"/>
             <w:tcBorders>
               <w:top w:val="nil"/>
               <w:left w:val="nil"/>
@@ -5485,7 +5485,7 @@
         </w:trPr>
         <w:tc>
           <w:tcPr>
-            <w:tcW w:w="323" w:type="dxa"/>
+            <w:tcW w:w="440" w:type="dxa"/>
             <w:tcBorders>
               <w:top w:val="nil"/>
               <w:left w:val="single" w:sz="4" w:space="0" w:color="auto"/>
@@ -5523,7 +5523,7 @@
         </w:tc>
         <w:tc>
           <w:tcPr>
-            <w:tcW w:w="1860" w:type="dxa"/>
+            <w:tcW w:w="1687" w:type="dxa"/>
             <w:vMerge/>
             <w:tcBorders>
               <w:top w:val="nil"/>
@@ -5550,7 +5550,7 @@
         </w:tc>
         <w:tc>
           <w:tcPr>
-            <w:tcW w:w="1320" w:type="dxa"/>
+            <w:tcW w:w="1197" w:type="dxa"/>
             <w:tcBorders>
               <w:top w:val="nil"/>
               <w:left w:val="nil"/>
@@ -5587,7 +5587,7 @@
         </w:tc>
         <w:tc>
           <w:tcPr>
-            <w:tcW w:w="1125" w:type="dxa"/>
+            <w:tcW w:w="1020" w:type="dxa"/>
             <w:vMerge/>
             <w:tcBorders>
               <w:top w:val="nil"/>
@@ -5614,7 +5614,7 @@
         </w:tc>
         <w:tc>
           <w:tcPr>
-            <w:tcW w:w="795" w:type="dxa"/>
+            <w:tcW w:w="721" w:type="dxa"/>
             <w:vMerge/>
             <w:tcBorders>
               <w:top w:val="nil"/>
@@ -5641,7 +5641,7 @@
         </w:tc>
         <w:tc>
           <w:tcPr>
-            <w:tcW w:w="906" w:type="dxa"/>
+            <w:tcW w:w="822" w:type="dxa"/>
             <w:vMerge/>
             <w:tcBorders>
               <w:top w:val="nil"/>
@@ -5668,7 +5668,7 @@
         </w:tc>
         <w:tc>
           <w:tcPr>
-            <w:tcW w:w="3985" w:type="dxa"/>
+            <w:tcW w:w="3467" w:type="dxa"/>
             <w:tcBorders>
               <w:top w:val="nil"/>
               <w:left w:val="nil"/>
@@ -5709,7 +5709,7 @@
         </w:trPr>
         <w:tc>
           <w:tcPr>
-            <w:tcW w:w="323" w:type="dxa"/>
+            <w:tcW w:w="440" w:type="dxa"/>
             <w:tcBorders>
               <w:top w:val="nil"/>
               <w:left w:val="single" w:sz="4" w:space="0" w:color="auto"/>
@@ -5747,7 +5747,7 @@
         </w:tc>
         <w:tc>
           <w:tcPr>
-            <w:tcW w:w="1860" w:type="dxa"/>
+            <w:tcW w:w="1687" w:type="dxa"/>
             <w:vMerge/>
             <w:tcBorders>
               <w:top w:val="nil"/>
@@ -5774,7 +5774,7 @@
         </w:tc>
         <w:tc>
           <w:tcPr>
-            <w:tcW w:w="1320" w:type="dxa"/>
+            <w:tcW w:w="1197" w:type="dxa"/>
             <w:tcBorders>
               <w:top w:val="nil"/>
               <w:left w:val="nil"/>
@@ -5811,7 +5811,7 @@
         </w:tc>
         <w:tc>
           <w:tcPr>
-            <w:tcW w:w="1125" w:type="dxa"/>
+            <w:tcW w:w="1020" w:type="dxa"/>
             <w:vMerge/>
             <w:tcBorders>
               <w:top w:val="nil"/>
@@ -5838,7 +5838,7 @@
         </w:tc>
         <w:tc>
           <w:tcPr>
-            <w:tcW w:w="795" w:type="dxa"/>
+            <w:tcW w:w="721" w:type="dxa"/>
             <w:vMerge/>
             <w:tcBorders>
               <w:top w:val="nil"/>
@@ -5865,7 +5865,7 @@
         </w:tc>
         <w:tc>
           <w:tcPr>
-            <w:tcW w:w="906" w:type="dxa"/>
+            <w:tcW w:w="822" w:type="dxa"/>
             <w:vMerge/>
             <w:tcBorders>
               <w:top w:val="nil"/>
@@ -5892,7 +5892,7 @@
         </w:tc>
         <w:tc>
           <w:tcPr>
-            <w:tcW w:w="3985" w:type="dxa"/>
+            <w:tcW w:w="3467" w:type="dxa"/>
             <w:tcBorders>
               <w:top w:val="nil"/>
               <w:left w:val="nil"/>
@@ -5933,7 +5933,7 @@
         </w:trPr>
         <w:tc>
           <w:tcPr>
-            <w:tcW w:w="323" w:type="dxa"/>
+            <w:tcW w:w="440" w:type="dxa"/>
             <w:tcBorders>
               <w:top w:val="nil"/>
               <w:left w:val="single" w:sz="4" w:space="0" w:color="auto"/>
@@ -5971,7 +5971,7 @@
         </w:tc>
         <w:tc>
           <w:tcPr>
-            <w:tcW w:w="1860" w:type="dxa"/>
+            <w:tcW w:w="1687" w:type="dxa"/>
             <w:vMerge/>
             <w:tcBorders>
               <w:top w:val="nil"/>
@@ -5998,7 +5998,7 @@
         </w:tc>
         <w:tc>
           <w:tcPr>
-            <w:tcW w:w="1320" w:type="dxa"/>
+            <w:tcW w:w="1197" w:type="dxa"/>
             <w:tcBorders>
               <w:top w:val="nil"/>
               <w:left w:val="nil"/>
@@ -6035,7 +6035,7 @@
         </w:tc>
         <w:tc>
           <w:tcPr>
-            <w:tcW w:w="1125" w:type="dxa"/>
+            <w:tcW w:w="1020" w:type="dxa"/>
             <w:vMerge/>
             <w:tcBorders>
               <w:top w:val="nil"/>
@@ -6062,7 +6062,7 @@
         </w:tc>
         <w:tc>
           <w:tcPr>
-            <w:tcW w:w="795" w:type="dxa"/>
+            <w:tcW w:w="721" w:type="dxa"/>
             <w:vMerge/>
             <w:tcBorders>
               <w:top w:val="nil"/>
@@ -6089,7 +6089,7 @@
         </w:tc>
         <w:tc>
           <w:tcPr>
-            <w:tcW w:w="906" w:type="dxa"/>
+            <w:tcW w:w="822" w:type="dxa"/>
             <w:vMerge/>
             <w:tcBorders>
               <w:top w:val="nil"/>
@@ -6116,7 +6116,7 @@
         </w:tc>
         <w:tc>
           <w:tcPr>
-            <w:tcW w:w="3985" w:type="dxa"/>
+            <w:tcW w:w="3467" w:type="dxa"/>
             <w:tcBorders>
               <w:top w:val="nil"/>
               <w:left w:val="nil"/>
@@ -6157,7 +6157,7 @@
         </w:trPr>
         <w:tc>
           <w:tcPr>
-            <w:tcW w:w="323" w:type="dxa"/>
+            <w:tcW w:w="440" w:type="dxa"/>
             <w:tcBorders>
               <w:top w:val="nil"/>
               <w:left w:val="single" w:sz="4" w:space="0" w:color="auto"/>
@@ -6195,7 +6195,7 @@
         </w:tc>
         <w:tc>
           <w:tcPr>
-            <w:tcW w:w="1860" w:type="dxa"/>
+            <w:tcW w:w="1687" w:type="dxa"/>
             <w:vMerge/>
             <w:tcBorders>
               <w:top w:val="nil"/>
@@ -6222,7 +6222,7 @@
         </w:tc>
         <w:tc>
           <w:tcPr>
-            <w:tcW w:w="1320" w:type="dxa"/>
+            <w:tcW w:w="1197" w:type="dxa"/>
             <w:tcBorders>
               <w:top w:val="nil"/>
               <w:left w:val="nil"/>
@@ -6259,7 +6259,7 @@
         </w:tc>
         <w:tc>
           <w:tcPr>
-            <w:tcW w:w="1125" w:type="dxa"/>
+            <w:tcW w:w="1020" w:type="dxa"/>
             <w:vMerge/>
             <w:tcBorders>
               <w:top w:val="nil"/>
@@ -6286,7 +6286,7 @@
         </w:tc>
         <w:tc>
           <w:tcPr>
-            <w:tcW w:w="795" w:type="dxa"/>
+            <w:tcW w:w="721" w:type="dxa"/>
             <w:vMerge/>
             <w:tcBorders>
               <w:top w:val="nil"/>
@@ -6313,7 +6313,7 @@
         </w:tc>
         <w:tc>
           <w:tcPr>
-            <w:tcW w:w="906" w:type="dxa"/>
+            <w:tcW w:w="822" w:type="dxa"/>
             <w:vMerge/>
             <w:tcBorders>
               <w:top w:val="nil"/>
@@ -6340,7 +6340,7 @@
         </w:tc>
         <w:tc>
           <w:tcPr>
-            <w:tcW w:w="3985" w:type="dxa"/>
+            <w:tcW w:w="3467" w:type="dxa"/>
             <w:tcBorders>
               <w:top w:val="nil"/>
               <w:left w:val="nil"/>
@@ -6381,7 +6381,7 @@
         </w:trPr>
         <w:tc>
           <w:tcPr>
-            <w:tcW w:w="323" w:type="dxa"/>
+            <w:tcW w:w="440" w:type="dxa"/>
             <w:tcBorders>
               <w:top w:val="nil"/>
               <w:left w:val="single" w:sz="4" w:space="0" w:color="auto"/>
@@ -6419,7 +6419,7 @@
         </w:tc>
         <w:tc>
           <w:tcPr>
-            <w:tcW w:w="1860" w:type="dxa"/>
+            <w:tcW w:w="1687" w:type="dxa"/>
             <w:vMerge/>
             <w:tcBorders>
               <w:top w:val="nil"/>
@@ -6446,7 +6446,7 @@
         </w:tc>
         <w:tc>
           <w:tcPr>
-            <w:tcW w:w="1320" w:type="dxa"/>
+            <w:tcW w:w="1197" w:type="dxa"/>
             <w:tcBorders>
               <w:top w:val="nil"/>
               <w:left w:val="nil"/>
@@ -6483,7 +6483,7 @@
         </w:tc>
         <w:tc>
           <w:tcPr>
-            <w:tcW w:w="1125" w:type="dxa"/>
+            <w:tcW w:w="1020" w:type="dxa"/>
             <w:vMerge/>
             <w:tcBorders>
               <w:top w:val="nil"/>
@@ -6510,7 +6510,7 @@
         </w:tc>
         <w:tc>
           <w:tcPr>
-            <w:tcW w:w="795" w:type="dxa"/>
+            <w:tcW w:w="721" w:type="dxa"/>
             <w:vMerge/>
             <w:tcBorders>
               <w:top w:val="nil"/>
@@ -6537,7 +6537,7 @@
         </w:tc>
         <w:tc>
           <w:tcPr>
-            <w:tcW w:w="906" w:type="dxa"/>
+            <w:tcW w:w="822" w:type="dxa"/>
             <w:vMerge/>
             <w:tcBorders>
               <w:top w:val="nil"/>
@@ -6564,7 +6564,7 @@
         </w:tc>
         <w:tc>
           <w:tcPr>
-            <w:tcW w:w="3985" w:type="dxa"/>
+            <w:tcW w:w="3467" w:type="dxa"/>
             <w:tcBorders>
               <w:top w:val="nil"/>
               <w:left w:val="nil"/>
@@ -6607,7 +6607,7 @@
         </w:trPr>
         <w:tc>
           <w:tcPr>
-            <w:tcW w:w="323" w:type="dxa"/>
+            <w:tcW w:w="440" w:type="dxa"/>
             <w:tcBorders>
               <w:top w:val="nil"/>
               <w:left w:val="single" w:sz="4" w:space="0" w:color="auto"/>
@@ -6645,7 +6645,7 @@
         </w:tc>
         <w:tc>
           <w:tcPr>
-            <w:tcW w:w="1860" w:type="dxa"/>
+            <w:tcW w:w="1687" w:type="dxa"/>
             <w:vMerge/>
             <w:tcBorders>
               <w:top w:val="nil"/>
@@ -6672,7 +6672,7 @@
         </w:tc>
         <w:tc>
           <w:tcPr>
-            <w:tcW w:w="1320" w:type="dxa"/>
+            <w:tcW w:w="1197" w:type="dxa"/>
             <w:tcBorders>
               <w:top w:val="nil"/>
               <w:left w:val="nil"/>
@@ -6709,7 +6709,7 @@
         </w:tc>
         <w:tc>
           <w:tcPr>
-            <w:tcW w:w="1125" w:type="dxa"/>
+            <w:tcW w:w="1020" w:type="dxa"/>
             <w:vMerge/>
             <w:tcBorders>
               <w:top w:val="nil"/>
@@ -6736,7 +6736,7 @@
         </w:tc>
         <w:tc>
           <w:tcPr>
-            <w:tcW w:w="795" w:type="dxa"/>
+            <w:tcW w:w="721" w:type="dxa"/>
             <w:vMerge/>
             <w:tcBorders>
               <w:top w:val="nil"/>
@@ -6763,7 +6763,7 @@
         </w:tc>
         <w:tc>
           <w:tcPr>
-            <w:tcW w:w="906" w:type="dxa"/>
+            <w:tcW w:w="822" w:type="dxa"/>
             <w:vMerge/>
             <w:tcBorders>
               <w:top w:val="nil"/>
@@ -6790,7 +6790,7 @@
         </w:tc>
         <w:tc>
           <w:tcPr>
-            <w:tcW w:w="3985" w:type="dxa"/>
+            <w:tcW w:w="3467" w:type="dxa"/>
             <w:tcBorders>
               <w:top w:val="nil"/>
               <w:left w:val="nil"/>
@@ -6831,7 +6831,7 @@
         </w:trPr>
         <w:tc>
           <w:tcPr>
-            <w:tcW w:w="323" w:type="dxa"/>
+            <w:tcW w:w="440" w:type="dxa"/>
             <w:tcBorders>
               <w:top w:val="nil"/>
               <w:left w:val="single" w:sz="4" w:space="0" w:color="auto"/>
@@ -6869,7 +6869,7 @@
         </w:tc>
         <w:tc>
           <w:tcPr>
-            <w:tcW w:w="1860" w:type="dxa"/>
+            <w:tcW w:w="1687" w:type="dxa"/>
             <w:vMerge/>
             <w:tcBorders>
               <w:top w:val="nil"/>
@@ -6896,7 +6896,7 @@
         </w:tc>
         <w:tc>
           <w:tcPr>
-            <w:tcW w:w="1320" w:type="dxa"/>
+            <w:tcW w:w="1197" w:type="dxa"/>
             <w:tcBorders>
               <w:top w:val="nil"/>
               <w:left w:val="nil"/>
@@ -6933,7 +6933,7 @@
         </w:tc>
         <w:tc>
           <w:tcPr>
-            <w:tcW w:w="1125" w:type="dxa"/>
+            <w:tcW w:w="1020" w:type="dxa"/>
             <w:vMerge/>
             <w:tcBorders>
               <w:top w:val="nil"/>
@@ -6960,7 +6960,7 @@
         </w:tc>
         <w:tc>
           <w:tcPr>
-            <w:tcW w:w="795" w:type="dxa"/>
+            <w:tcW w:w="721" w:type="dxa"/>
             <w:vMerge/>
             <w:tcBorders>
               <w:top w:val="nil"/>
@@ -6987,7 +6987,7 @@
         </w:tc>
         <w:tc>
           <w:tcPr>
-            <w:tcW w:w="906" w:type="dxa"/>
+            <w:tcW w:w="822" w:type="dxa"/>
             <w:vMerge/>
             <w:tcBorders>
               <w:top w:val="nil"/>
@@ -7014,7 +7014,7 @@
         </w:tc>
         <w:tc>
           <w:tcPr>
-            <w:tcW w:w="3985" w:type="dxa"/>
+            <w:tcW w:w="3467" w:type="dxa"/>
             <w:tcBorders>
               <w:top w:val="nil"/>
               <w:left w:val="nil"/>
@@ -7055,7 +7055,7 @@
         </w:trPr>
         <w:tc>
           <w:tcPr>
-            <w:tcW w:w="323" w:type="dxa"/>
+            <w:tcW w:w="440" w:type="dxa"/>
             <w:tcBorders>
               <w:top w:val="nil"/>
               <w:left w:val="single" w:sz="4" w:space="0" w:color="auto"/>
@@ -7093,7 +7093,7 @@
         </w:tc>
         <w:tc>
           <w:tcPr>
-            <w:tcW w:w="1860" w:type="dxa"/>
+            <w:tcW w:w="1687" w:type="dxa"/>
             <w:vMerge/>
             <w:tcBorders>
               <w:top w:val="nil"/>
@@ -7120,7 +7120,7 @@
         </w:tc>
         <w:tc>
           <w:tcPr>
-            <w:tcW w:w="1320" w:type="dxa"/>
+            <w:tcW w:w="1197" w:type="dxa"/>
             <w:tcBorders>
               <w:top w:val="nil"/>
               <w:left w:val="nil"/>
@@ -7157,7 +7157,7 @@
         </w:tc>
         <w:tc>
           <w:tcPr>
-            <w:tcW w:w="1125" w:type="dxa"/>
+            <w:tcW w:w="1020" w:type="dxa"/>
             <w:vMerge/>
             <w:tcBorders>
               <w:top w:val="nil"/>
@@ -7184,7 +7184,7 @@
         </w:tc>
         <w:tc>
           <w:tcPr>
-            <w:tcW w:w="795" w:type="dxa"/>
+            <w:tcW w:w="721" w:type="dxa"/>
             <w:vMerge/>
             <w:tcBorders>
               <w:top w:val="nil"/>
@@ -7211,7 +7211,7 @@
         </w:tc>
         <w:tc>
           <w:tcPr>
-            <w:tcW w:w="906" w:type="dxa"/>
+            <w:tcW w:w="822" w:type="dxa"/>
             <w:vMerge/>
             <w:tcBorders>
               <w:top w:val="nil"/>
@@ -7238,7 +7238,7 @@
         </w:tc>
         <w:tc>
           <w:tcPr>
-            <w:tcW w:w="3985" w:type="dxa"/>
+            <w:tcW w:w="3467" w:type="dxa"/>
             <w:tcBorders>
               <w:top w:val="nil"/>
               <w:left w:val="nil"/>
@@ -7279,7 +7279,7 @@
         </w:trPr>
         <w:tc>
           <w:tcPr>
-            <w:tcW w:w="323" w:type="dxa"/>
+            <w:tcW w:w="440" w:type="dxa"/>
             <w:tcBorders>
               <w:top w:val="nil"/>
               <w:left w:val="single" w:sz="4" w:space="0" w:color="auto"/>
@@ -7316,7 +7316,7 @@
         </w:tc>
         <w:tc>
           <w:tcPr>
-            <w:tcW w:w="1860" w:type="dxa"/>
+            <w:tcW w:w="1687" w:type="dxa"/>
             <w:tcBorders>
               <w:top w:val="nil"/>
               <w:left w:val="nil"/>
@@ -7351,7 +7351,7 @@
         </w:tc>
         <w:tc>
           <w:tcPr>
-            <w:tcW w:w="1320" w:type="dxa"/>
+            <w:tcW w:w="1197" w:type="dxa"/>
             <w:tcBorders>
               <w:top w:val="nil"/>
               <w:left w:val="nil"/>
@@ -7387,7 +7387,7 @@
         </w:tc>
         <w:tc>
           <w:tcPr>
-            <w:tcW w:w="1125" w:type="dxa"/>
+            <w:tcW w:w="1020" w:type="dxa"/>
             <w:tcBorders>
               <w:top w:val="nil"/>
               <w:left w:val="nil"/>
@@ -7423,7 +7423,7 @@
         </w:tc>
         <w:tc>
           <w:tcPr>
-            <w:tcW w:w="795" w:type="dxa"/>
+            <w:tcW w:w="721" w:type="dxa"/>
             <w:tcBorders>
               <w:top w:val="nil"/>
               <w:left w:val="nil"/>
@@ -7459,7 +7459,7 @@
         </w:tc>
         <w:tc>
           <w:tcPr>
-            <w:tcW w:w="906" w:type="dxa"/>
+            <w:tcW w:w="822" w:type="dxa"/>
             <w:tcBorders>
               <w:top w:val="nil"/>
               <w:left w:val="nil"/>
@@ -7495,7 +7495,7 @@
         </w:tc>
         <w:tc>
           <w:tcPr>
-            <w:tcW w:w="3985" w:type="dxa"/>
+            <w:tcW w:w="3467" w:type="dxa"/>
             <w:tcBorders>
               <w:top w:val="nil"/>
               <w:left w:val="nil"/>
@@ -7535,7 +7535,7 @@
         </w:trPr>
         <w:tc>
           <w:tcPr>
-            <w:tcW w:w="323" w:type="dxa"/>
+            <w:tcW w:w="440" w:type="dxa"/>
             <w:tcBorders>
               <w:top w:val="nil"/>
               <w:left w:val="single" w:sz="4" w:space="0" w:color="auto"/>
@@ -7572,7 +7572,7 @@
         </w:tc>
         <w:tc>
           <w:tcPr>
-            <w:tcW w:w="1860" w:type="dxa"/>
+            <w:tcW w:w="1687" w:type="dxa"/>
             <w:tcBorders>
               <w:top w:val="nil"/>
               <w:left w:val="nil"/>
@@ -7608,7 +7608,7 @@
         </w:tc>
         <w:tc>
           <w:tcPr>
-            <w:tcW w:w="1320" w:type="dxa"/>
+            <w:tcW w:w="1197" w:type="dxa"/>
             <w:tcBorders>
               <w:top w:val="nil"/>
               <w:left w:val="nil"/>
@@ -7644,7 +7644,7 @@
         </w:tc>
         <w:tc>
           <w:tcPr>
-            <w:tcW w:w="1125" w:type="dxa"/>
+            <w:tcW w:w="1020" w:type="dxa"/>
             <w:tcBorders>
               <w:top w:val="nil"/>
               <w:left w:val="nil"/>
@@ -7680,7 +7680,7 @@
         </w:tc>
         <w:tc>
           <w:tcPr>
-            <w:tcW w:w="795" w:type="dxa"/>
+            <w:tcW w:w="721" w:type="dxa"/>
             <w:tcBorders>
               <w:top w:val="nil"/>
               <w:left w:val="nil"/>
@@ -7716,7 +7716,7 @@
         </w:tc>
         <w:tc>
           <w:tcPr>
-            <w:tcW w:w="906" w:type="dxa"/>
+            <w:tcW w:w="822" w:type="dxa"/>
             <w:tcBorders>
               <w:top w:val="nil"/>
               <w:left w:val="nil"/>
@@ -7752,7 +7752,7 @@
         </w:tc>
         <w:tc>
           <w:tcPr>
-            <w:tcW w:w="3985" w:type="dxa"/>
+            <w:tcW w:w="3467" w:type="dxa"/>
             <w:tcBorders>
               <w:top w:val="nil"/>
               <w:left w:val="nil"/>
@@ -7792,7 +7792,7 @@
         </w:trPr>
         <w:tc>
           <w:tcPr>
-            <w:tcW w:w="323" w:type="dxa"/>
+            <w:tcW w:w="440" w:type="dxa"/>
             <w:tcBorders>
               <w:top w:val="nil"/>
               <w:left w:val="single" w:sz="4" w:space="0" w:color="auto"/>
@@ -7829,7 +7829,7 @@
         </w:tc>
         <w:tc>
           <w:tcPr>
-            <w:tcW w:w="1860" w:type="dxa"/>
+            <w:tcW w:w="1687" w:type="dxa"/>
             <w:tcBorders>
               <w:top w:val="nil"/>
               <w:left w:val="nil"/>
@@ -7865,7 +7865,7 @@
         </w:tc>
         <w:tc>
           <w:tcPr>
-            <w:tcW w:w="1320" w:type="dxa"/>
+            <w:tcW w:w="1197" w:type="dxa"/>
             <w:tcBorders>
               <w:top w:val="nil"/>
               <w:left w:val="nil"/>
@@ -7901,7 +7901,7 @@
         </w:tc>
         <w:tc>
           <w:tcPr>
-            <w:tcW w:w="1125" w:type="dxa"/>
+            <w:tcW w:w="1020" w:type="dxa"/>
             <w:tcBorders>
               <w:top w:val="nil"/>
               <w:left w:val="nil"/>
@@ -7937,7 +7937,7 @@
         </w:tc>
         <w:tc>
           <w:tcPr>
-            <w:tcW w:w="795" w:type="dxa"/>
+            <w:tcW w:w="721" w:type="dxa"/>
             <w:tcBorders>
               <w:top w:val="nil"/>
               <w:left w:val="nil"/>
@@ -7973,7 +7973,7 @@
         </w:tc>
         <w:tc>
           <w:tcPr>
-            <w:tcW w:w="906" w:type="dxa"/>
+            <w:tcW w:w="822" w:type="dxa"/>
             <w:tcBorders>
               <w:top w:val="nil"/>
               <w:left w:val="nil"/>
@@ -8009,7 +8009,7 @@
         </w:tc>
         <w:tc>
           <w:tcPr>
-            <w:tcW w:w="3985" w:type="dxa"/>
+            <w:tcW w:w="3467" w:type="dxa"/>
             <w:tcBorders>
               <w:top w:val="nil"/>
               <w:left w:val="nil"/>
@@ -8063,7 +8063,7 @@
         </w:trPr>
         <w:tc>
           <w:tcPr>
-            <w:tcW w:w="323" w:type="dxa"/>
+            <w:tcW w:w="440" w:type="dxa"/>
             <w:tcBorders>
               <w:top w:val="nil"/>
               <w:left w:val="single" w:sz="4" w:space="0" w:color="auto"/>
@@ -8100,7 +8100,7 @@
         </w:tc>
         <w:tc>
           <w:tcPr>
-            <w:tcW w:w="1860" w:type="dxa"/>
+            <w:tcW w:w="1687" w:type="dxa"/>
             <w:tcBorders>
               <w:top w:val="nil"/>
               <w:left w:val="nil"/>
@@ -8136,7 +8136,7 @@
         </w:tc>
         <w:tc>
           <w:tcPr>
-            <w:tcW w:w="1320" w:type="dxa"/>
+            <w:tcW w:w="1197" w:type="dxa"/>
             <w:tcBorders>
               <w:top w:val="nil"/>
               <w:left w:val="nil"/>
@@ -8172,7 +8172,7 @@
         </w:tc>
         <w:tc>
           <w:tcPr>
-            <w:tcW w:w="1125" w:type="dxa"/>
+            <w:tcW w:w="1020" w:type="dxa"/>
             <w:tcBorders>
               <w:top w:val="nil"/>
               <w:left w:val="nil"/>
@@ -8208,7 +8208,7 @@
         </w:tc>
         <w:tc>
           <w:tcPr>
-            <w:tcW w:w="795" w:type="dxa"/>
+            <w:tcW w:w="721" w:type="dxa"/>
             <w:tcBorders>
               <w:top w:val="nil"/>
               <w:left w:val="nil"/>
@@ -8244,7 +8244,7 @@
         </w:tc>
         <w:tc>
           <w:tcPr>
-            <w:tcW w:w="906" w:type="dxa"/>
+            <w:tcW w:w="822" w:type="dxa"/>
             <w:tcBorders>
               <w:top w:val="nil"/>
               <w:left w:val="nil"/>
@@ -8280,7 +8280,7 @@
         </w:tc>
         <w:tc>
           <w:tcPr>
-            <w:tcW w:w="3985" w:type="dxa"/>
+            <w:tcW w:w="3467" w:type="dxa"/>
             <w:tcBorders>
               <w:top w:val="nil"/>
               <w:left w:val="nil"/>
@@ -8334,7 +8334,7 @@
         </w:trPr>
         <w:tc>
           <w:tcPr>
-            <w:tcW w:w="323" w:type="dxa"/>
+            <w:tcW w:w="440" w:type="dxa"/>
             <w:tcBorders>
               <w:top w:val="nil"/>
               <w:left w:val="single" w:sz="4" w:space="0" w:color="auto"/>
@@ -8371,7 +8371,7 @@
         </w:tc>
         <w:tc>
           <w:tcPr>
-            <w:tcW w:w="1860" w:type="dxa"/>
+            <w:tcW w:w="1687" w:type="dxa"/>
             <w:tcBorders>
               <w:top w:val="nil"/>
               <w:left w:val="nil"/>
@@ -8407,7 +8407,7 @@
         </w:tc>
         <w:tc>
           <w:tcPr>
-            <w:tcW w:w="1320" w:type="dxa"/>
+            <w:tcW w:w="1197" w:type="dxa"/>
             <w:tcBorders>
               <w:top w:val="nil"/>
               <w:left w:val="nil"/>
@@ -8443,7 +8443,7 @@
         </w:tc>
         <w:tc>
           <w:tcPr>
-            <w:tcW w:w="1125" w:type="dxa"/>
+            <w:tcW w:w="1020" w:type="dxa"/>
             <w:tcBorders>
               <w:top w:val="nil"/>
               <w:left w:val="nil"/>
@@ -8479,7 +8479,7 @@
         </w:tc>
         <w:tc>
           <w:tcPr>
-            <w:tcW w:w="795" w:type="dxa"/>
+            <w:tcW w:w="721" w:type="dxa"/>
             <w:tcBorders>
               <w:top w:val="nil"/>
               <w:left w:val="nil"/>
@@ -8515,7 +8515,7 @@
         </w:tc>
         <w:tc>
           <w:tcPr>
-            <w:tcW w:w="906" w:type="dxa"/>
+            <w:tcW w:w="822" w:type="dxa"/>
             <w:tcBorders>
               <w:top w:val="nil"/>
               <w:left w:val="nil"/>
@@ -8551,7 +8551,7 @@
         </w:tc>
         <w:tc>
           <w:tcPr>
-            <w:tcW w:w="3985" w:type="dxa"/>
+            <w:tcW w:w="3467" w:type="dxa"/>
             <w:tcBorders>
               <w:top w:val="nil"/>
               <w:left w:val="nil"/>
@@ -8591,7 +8591,7 @@
         </w:trPr>
         <w:tc>
           <w:tcPr>
-            <w:tcW w:w="323" w:type="dxa"/>
+            <w:tcW w:w="440" w:type="dxa"/>
             <w:tcBorders>
               <w:top w:val="nil"/>
               <w:left w:val="single" w:sz="4" w:space="0" w:color="auto"/>
@@ -8628,7 +8628,7 @@
         </w:tc>
         <w:tc>
           <w:tcPr>
-            <w:tcW w:w="1860" w:type="dxa"/>
+            <w:tcW w:w="1687" w:type="dxa"/>
             <w:tcBorders>
               <w:top w:val="nil"/>
               <w:left w:val="nil"/>
@@ -8664,7 +8664,7 @@
         </w:tc>
         <w:tc>
           <w:tcPr>
-            <w:tcW w:w="1320" w:type="dxa"/>
+            <w:tcW w:w="1197" w:type="dxa"/>
             <w:tcBorders>
               <w:top w:val="nil"/>
               <w:left w:val="nil"/>
@@ -8700,7 +8700,7 @@
         </w:tc>
         <w:tc>
           <w:tcPr>
-            <w:tcW w:w="1125" w:type="dxa"/>
+            <w:tcW w:w="1020" w:type="dxa"/>
             <w:tcBorders>
               <w:top w:val="nil"/>
               <w:left w:val="nil"/>
@@ -8736,7 +8736,7 @@
         </w:tc>
         <w:tc>
           <w:tcPr>
-            <w:tcW w:w="795" w:type="dxa"/>
+            <w:tcW w:w="721" w:type="dxa"/>
             <w:tcBorders>
               <w:top w:val="nil"/>
               <w:left w:val="nil"/>
@@ -8772,7 +8772,7 @@
         </w:tc>
         <w:tc>
           <w:tcPr>
-            <w:tcW w:w="906" w:type="dxa"/>
+            <w:tcW w:w="822" w:type="dxa"/>
             <w:tcBorders>
               <w:top w:val="nil"/>
               <w:left w:val="nil"/>
@@ -8808,7 +8808,7 @@
         </w:tc>
         <w:tc>
           <w:tcPr>
-            <w:tcW w:w="3985" w:type="dxa"/>
+            <w:tcW w:w="3467" w:type="dxa"/>
             <w:tcBorders>
               <w:top w:val="nil"/>
               <w:left w:val="nil"/>
@@ -8862,7 +8862,7 @@
         </w:trPr>
         <w:tc>
           <w:tcPr>
-            <w:tcW w:w="323" w:type="dxa"/>
+            <w:tcW w:w="440" w:type="dxa"/>
             <w:tcBorders>
               <w:top w:val="nil"/>
               <w:left w:val="single" w:sz="4" w:space="0" w:color="auto"/>
@@ -8899,7 +8899,7 @@
         </w:tc>
         <w:tc>
           <w:tcPr>
-            <w:tcW w:w="1860" w:type="dxa"/>
+            <w:tcW w:w="1687" w:type="dxa"/>
             <w:tcBorders>
               <w:top w:val="nil"/>
               <w:left w:val="nil"/>
@@ -8935,7 +8935,7 @@
         </w:tc>
         <w:tc>
           <w:tcPr>
-            <w:tcW w:w="1320" w:type="dxa"/>
+            <w:tcW w:w="1197" w:type="dxa"/>
             <w:tcBorders>
               <w:top w:val="nil"/>
               <w:left w:val="nil"/>
@@ -8971,7 +8971,7 @@
         </w:tc>
         <w:tc>
           <w:tcPr>
-            <w:tcW w:w="1125" w:type="dxa"/>
+            <w:tcW w:w="1020" w:type="dxa"/>
             <w:tcBorders>
               <w:top w:val="nil"/>
               <w:left w:val="nil"/>
@@ -9007,7 +9007,7 @@
         </w:tc>
         <w:tc>
           <w:tcPr>
-            <w:tcW w:w="795" w:type="dxa"/>
+            <w:tcW w:w="721" w:type="dxa"/>
             <w:tcBorders>
               <w:top w:val="nil"/>
               <w:left w:val="nil"/>
@@ -9043,7 +9043,7 @@
         </w:tc>
         <w:tc>
           <w:tcPr>
-            <w:tcW w:w="906" w:type="dxa"/>
+            <w:tcW w:w="822" w:type="dxa"/>
             <w:tcBorders>
               <w:top w:val="nil"/>
               <w:left w:val="nil"/>
@@ -9079,7 +9079,7 @@
         </w:tc>
         <w:tc>
           <w:tcPr>
-            <w:tcW w:w="3985" w:type="dxa"/>
+            <w:tcW w:w="3467" w:type="dxa"/>
             <w:tcBorders>
               <w:top w:val="nil"/>
               <w:left w:val="nil"/>
@@ -9119,7 +9119,7 @@
         </w:trPr>
         <w:tc>
           <w:tcPr>
-            <w:tcW w:w="323" w:type="dxa"/>
+            <w:tcW w:w="440" w:type="dxa"/>
             <w:tcBorders>
               <w:top w:val="nil"/>
               <w:left w:val="single" w:sz="4" w:space="0" w:color="auto"/>
@@ -9156,7 +9156,7 @@
         </w:tc>
         <w:tc>
           <w:tcPr>
-            <w:tcW w:w="1860" w:type="dxa"/>
+            <w:tcW w:w="1687" w:type="dxa"/>
             <w:tcBorders>
               <w:top w:val="nil"/>
               <w:left w:val="nil"/>
@@ -9193,7 +9193,7 @@
         </w:tc>
         <w:tc>
           <w:tcPr>
-            <w:tcW w:w="1320" w:type="dxa"/>
+            <w:tcW w:w="1197" w:type="dxa"/>
             <w:tcBorders>
               <w:top w:val="nil"/>
               <w:left w:val="nil"/>
@@ -9228,7 +9228,7 @@
         </w:tc>
         <w:tc>
           <w:tcPr>
-            <w:tcW w:w="1125" w:type="dxa"/>
+            <w:tcW w:w="1020" w:type="dxa"/>
             <w:tcBorders>
               <w:top w:val="nil"/>
               <w:left w:val="nil"/>
@@ -9264,7 +9264,7 @@
         </w:tc>
         <w:tc>
           <w:tcPr>
-            <w:tcW w:w="795" w:type="dxa"/>
+            <w:tcW w:w="721" w:type="dxa"/>
             <w:tcBorders>
               <w:top w:val="nil"/>
               <w:left w:val="nil"/>
@@ -9300,7 +9300,7 @@
         </w:tc>
         <w:tc>
           <w:tcPr>
-            <w:tcW w:w="906" w:type="dxa"/>
+            <w:tcW w:w="822" w:type="dxa"/>
             <w:tcBorders>
               <w:top w:val="nil"/>
               <w:left w:val="nil"/>
@@ -9336,7 +9336,7 @@
         </w:tc>
         <w:tc>
           <w:tcPr>
-            <w:tcW w:w="3985" w:type="dxa"/>
+            <w:tcW w:w="3467" w:type="dxa"/>
             <w:tcBorders>
               <w:top w:val="nil"/>
               <w:left w:val="nil"/>
@@ -9390,7 +9390,7 @@
         </w:trPr>
         <w:tc>
           <w:tcPr>
-            <w:tcW w:w="323" w:type="dxa"/>
+            <w:tcW w:w="440" w:type="dxa"/>
             <w:tcBorders>
               <w:top w:val="nil"/>
               <w:left w:val="single" w:sz="4" w:space="0" w:color="auto"/>
@@ -9427,7 +9427,7 @@
         </w:tc>
         <w:tc>
           <w:tcPr>
-            <w:tcW w:w="1860" w:type="dxa"/>
+            <w:tcW w:w="1687" w:type="dxa"/>
             <w:tcBorders>
               <w:top w:val="nil"/>
               <w:left w:val="nil"/>
@@ -9464,7 +9464,7 @@
         </w:tc>
         <w:tc>
           <w:tcPr>
-            <w:tcW w:w="1320" w:type="dxa"/>
+            <w:tcW w:w="1197" w:type="dxa"/>
             <w:tcBorders>
               <w:top w:val="nil"/>
               <w:left w:val="nil"/>
@@ -9499,7 +9499,7 @@
         </w:tc>
         <w:tc>
           <w:tcPr>
-            <w:tcW w:w="1125" w:type="dxa"/>
+            <w:tcW w:w="1020" w:type="dxa"/>
             <w:tcBorders>
               <w:top w:val="nil"/>
               <w:left w:val="nil"/>
@@ -9535,7 +9535,7 @@
         </w:tc>
         <w:tc>
           <w:tcPr>
-            <w:tcW w:w="795" w:type="dxa"/>
+            <w:tcW w:w="721" w:type="dxa"/>
             <w:tcBorders>
               <w:top w:val="nil"/>
               <w:left w:val="nil"/>
@@ -9571,7 +9571,7 @@
         </w:tc>
         <w:tc>
           <w:tcPr>
-            <w:tcW w:w="906" w:type="dxa"/>
+            <w:tcW w:w="822" w:type="dxa"/>
             <w:tcBorders>
               <w:top w:val="nil"/>
               <w:left w:val="nil"/>
@@ -9607,7 +9607,7 @@
         </w:tc>
         <w:tc>
           <w:tcPr>
-            <w:tcW w:w="3985" w:type="dxa"/>
+            <w:tcW w:w="3467" w:type="dxa"/>
             <w:tcBorders>
               <w:top w:val="nil"/>
               <w:left w:val="nil"/>
@@ -9663,7 +9663,7 @@
         </w:trPr>
         <w:tc>
           <w:tcPr>
-            <w:tcW w:w="323" w:type="dxa"/>
+            <w:tcW w:w="440" w:type="dxa"/>
             <w:tcBorders>
               <w:top w:val="nil"/>
               <w:left w:val="single" w:sz="4" w:space="0" w:color="auto"/>
@@ -9700,7 +9700,7 @@
         </w:tc>
         <w:tc>
           <w:tcPr>
-            <w:tcW w:w="1860" w:type="dxa"/>
+            <w:tcW w:w="1687" w:type="dxa"/>
             <w:tcBorders>
               <w:top w:val="nil"/>
               <w:left w:val="nil"/>
@@ -9735,7 +9735,7 @@
         </w:tc>
         <w:tc>
           <w:tcPr>
-            <w:tcW w:w="1320" w:type="dxa"/>
+            <w:tcW w:w="1197" w:type="dxa"/>
             <w:tcBorders>
               <w:top w:val="nil"/>
               <w:left w:val="nil"/>
@@ -9770,7 +9770,7 @@
         </w:tc>
         <w:tc>
           <w:tcPr>
-            <w:tcW w:w="1125" w:type="dxa"/>
+            <w:tcW w:w="1020" w:type="dxa"/>
             <w:tcBorders>
               <w:top w:val="nil"/>
               <w:left w:val="nil"/>
@@ -9806,7 +9806,7 @@
         </w:tc>
         <w:tc>
           <w:tcPr>
-            <w:tcW w:w="795" w:type="dxa"/>
+            <w:tcW w:w="721" w:type="dxa"/>
             <w:tcBorders>
               <w:top w:val="nil"/>
               <w:left w:val="nil"/>
@@ -9842,7 +9842,7 @@
         </w:tc>
         <w:tc>
           <w:tcPr>
-            <w:tcW w:w="906" w:type="dxa"/>
+            <w:tcW w:w="822" w:type="dxa"/>
             <w:tcBorders>
               <w:top w:val="nil"/>
               <w:left w:val="nil"/>
@@ -9878,7 +9878,7 @@
         </w:tc>
         <w:tc>
           <w:tcPr>
-            <w:tcW w:w="3985" w:type="dxa"/>
+            <w:tcW w:w="3467" w:type="dxa"/>
             <w:tcBorders>
               <w:top w:val="nil"/>
               <w:left w:val="nil"/>
@@ -9932,7 +9932,7 @@
         </w:trPr>
         <w:tc>
           <w:tcPr>
-            <w:tcW w:w="323" w:type="dxa"/>
+            <w:tcW w:w="440" w:type="dxa"/>
             <w:tcBorders>
               <w:top w:val="nil"/>
               <w:left w:val="single" w:sz="4" w:space="0" w:color="auto"/>
@@ -9969,7 +9969,7 @@
         </w:tc>
         <w:tc>
           <w:tcPr>
-            <w:tcW w:w="1860" w:type="dxa"/>
+            <w:tcW w:w="1687" w:type="dxa"/>
             <w:tcBorders>
               <w:top w:val="nil"/>
               <w:left w:val="nil"/>
@@ -10003,7 +10003,7 @@
         </w:tc>
         <w:tc>
           <w:tcPr>
-            <w:tcW w:w="1320" w:type="dxa"/>
+            <w:tcW w:w="1197" w:type="dxa"/>
             <w:tcBorders>
               <w:top w:val="nil"/>
               <w:left w:val="nil"/>
@@ -10037,7 +10037,7 @@
         </w:tc>
         <w:tc>
           <w:tcPr>
-            <w:tcW w:w="1125" w:type="dxa"/>
+            <w:tcW w:w="1020" w:type="dxa"/>
             <w:tcBorders>
               <w:top w:val="nil"/>
               <w:left w:val="nil"/>
@@ -10072,7 +10072,7 @@
         </w:tc>
         <w:tc>
           <w:tcPr>
-            <w:tcW w:w="795" w:type="dxa"/>
+            <w:tcW w:w="721" w:type="dxa"/>
             <w:tcBorders>
               <w:top w:val="nil"/>
               <w:left w:val="nil"/>
@@ -10107,7 +10107,7 @@
         </w:tc>
         <w:tc>
           <w:tcPr>
-            <w:tcW w:w="906" w:type="dxa"/>
+            <w:tcW w:w="822" w:type="dxa"/>
             <w:tcBorders>
               <w:top w:val="nil"/>
               <w:left w:val="nil"/>
@@ -10142,7 +10142,7 @@
         </w:tc>
         <w:tc>
           <w:tcPr>
-            <w:tcW w:w="3985" w:type="dxa"/>
+            <w:tcW w:w="3467" w:type="dxa"/>
             <w:tcBorders>
               <w:top w:val="nil"/>
               <w:left w:val="nil"/>
@@ -10194,7 +10194,7 @@
         </w:trPr>
         <w:tc>
           <w:tcPr>
-            <w:tcW w:w="323" w:type="dxa"/>
+            <w:tcW w:w="440" w:type="dxa"/>
             <w:tcBorders>
               <w:top w:val="nil"/>
               <w:left w:val="single" w:sz="4" w:space="0" w:color="auto"/>
@@ -10231,7 +10231,7 @@
         </w:tc>
         <w:tc>
           <w:tcPr>
-            <w:tcW w:w="1860" w:type="dxa"/>
+            <w:tcW w:w="1687" w:type="dxa"/>
             <w:tcBorders>
               <w:top w:val="nil"/>
               <w:left w:val="nil"/>
@@ -10266,7 +10266,7 @@
         </w:tc>
         <w:tc>
           <w:tcPr>
-            <w:tcW w:w="1320" w:type="dxa"/>
+            <w:tcW w:w="1197" w:type="dxa"/>
             <w:tcBorders>
               <w:top w:val="nil"/>
               <w:left w:val="nil"/>
@@ -10301,7 +10301,7 @@
         </w:tc>
         <w:tc>
           <w:tcPr>
-            <w:tcW w:w="1125" w:type="dxa"/>
+            <w:tcW w:w="1020" w:type="dxa"/>
             <w:tcBorders>
               <w:top w:val="nil"/>
               <w:left w:val="nil"/>
@@ -10337,7 +10337,7 @@
         </w:tc>
         <w:tc>
           <w:tcPr>
-            <w:tcW w:w="795" w:type="dxa"/>
+            <w:tcW w:w="721" w:type="dxa"/>
             <w:tcBorders>
               <w:top w:val="nil"/>
               <w:left w:val="nil"/>
@@ -10373,7 +10373,7 @@
         </w:tc>
         <w:tc>
           <w:tcPr>
-            <w:tcW w:w="906" w:type="dxa"/>
+            <w:tcW w:w="822" w:type="dxa"/>
             <w:tcBorders>
               <w:top w:val="nil"/>
               <w:left w:val="nil"/>
@@ -10409,7 +10409,7 @@
         </w:tc>
         <w:tc>
           <w:tcPr>
-            <w:tcW w:w="3985" w:type="dxa"/>
+            <w:tcW w:w="3467" w:type="dxa"/>
             <w:tcBorders>
               <w:top w:val="nil"/>
               <w:left w:val="nil"/>
@@ -10463,7 +10463,7 @@
         </w:trPr>
         <w:tc>
           <w:tcPr>
-            <w:tcW w:w="323" w:type="dxa"/>
+            <w:tcW w:w="440" w:type="dxa"/>
             <w:tcBorders>
               <w:top w:val="nil"/>
               <w:left w:val="single" w:sz="4" w:space="0" w:color="auto"/>
@@ -10499,7 +10499,7 @@
         </w:tc>
         <w:tc>
           <w:tcPr>
-            <w:tcW w:w="1860" w:type="dxa"/>
+            <w:tcW w:w="1687" w:type="dxa"/>
             <w:tcBorders>
               <w:top w:val="nil"/>
               <w:left w:val="nil"/>
@@ -10533,7 +10533,7 @@
         </w:tc>
         <w:tc>
           <w:tcPr>
-            <w:tcW w:w="1320" w:type="dxa"/>
+            <w:tcW w:w="1197" w:type="dxa"/>
             <w:tcBorders>
               <w:top w:val="nil"/>
               <w:left w:val="nil"/>
@@ -10567,7 +10567,7 @@
         </w:tc>
         <w:tc>
           <w:tcPr>
-            <w:tcW w:w="1125" w:type="dxa"/>
+            <w:tcW w:w="1020" w:type="dxa"/>
             <w:tcBorders>
               <w:top w:val="nil"/>
               <w:left w:val="nil"/>
@@ -10602,7 +10602,7 @@
         </w:tc>
         <w:tc>
           <w:tcPr>
-            <w:tcW w:w="795" w:type="dxa"/>
+            <w:tcW w:w="721" w:type="dxa"/>
             <w:tcBorders>
               <w:top w:val="nil"/>
               <w:left w:val="nil"/>
@@ -10637,7 +10637,7 @@
         </w:tc>
         <w:tc>
           <w:tcPr>
-            <w:tcW w:w="906" w:type="dxa"/>
+            <w:tcW w:w="822" w:type="dxa"/>
             <w:tcBorders>
               <w:top w:val="nil"/>
               <w:left w:val="nil"/>
@@ -10672,7 +10672,7 @@
         </w:tc>
         <w:tc>
           <w:tcPr>
-            <w:tcW w:w="3985" w:type="dxa"/>
+            <w:tcW w:w="3467" w:type="dxa"/>
             <w:tcBorders>
               <w:top w:val="nil"/>
               <w:left w:val="nil"/>
@@ -10724,7 +10724,7 @@
         </w:trPr>
         <w:tc>
           <w:tcPr>
-            <w:tcW w:w="323" w:type="dxa"/>
+            <w:tcW w:w="440" w:type="dxa"/>
             <w:tcBorders>
               <w:top w:val="nil"/>
               <w:left w:val="single" w:sz="4" w:space="0" w:color="auto"/>
@@ -10761,7 +10761,7 @@
         </w:tc>
         <w:tc>
           <w:tcPr>
-            <w:tcW w:w="1860" w:type="dxa"/>
+            <w:tcW w:w="1687" w:type="dxa"/>
             <w:tcBorders>
               <w:top w:val="nil"/>
               <w:left w:val="nil"/>
@@ -10796,7 +10796,7 @@
         </w:tc>
         <w:tc>
           <w:tcPr>
-            <w:tcW w:w="1320" w:type="dxa"/>
+            <w:tcW w:w="1197" w:type="dxa"/>
             <w:tcBorders>
               <w:top w:val="nil"/>
               <w:left w:val="nil"/>
@@ -10831,7 +10831,7 @@
         </w:tc>
         <w:tc>
           <w:tcPr>
-            <w:tcW w:w="1125" w:type="dxa"/>
+            <w:tcW w:w="1020" w:type="dxa"/>
             <w:tcBorders>
               <w:top w:val="nil"/>
               <w:left w:val="nil"/>
@@ -10867,7 +10867,7 @@
         </w:tc>
         <w:tc>
           <w:tcPr>
-            <w:tcW w:w="795" w:type="dxa"/>
+            <w:tcW w:w="721" w:type="dxa"/>
             <w:tcBorders>
               <w:top w:val="nil"/>
               <w:left w:val="nil"/>
@@ -10903,7 +10903,7 @@
         </w:tc>
         <w:tc>
           <w:tcPr>
-            <w:tcW w:w="906" w:type="dxa"/>
+            <w:tcW w:w="822" w:type="dxa"/>
             <w:tcBorders>
               <w:top w:val="nil"/>
               <w:left w:val="nil"/>
@@ -10939,7 +10939,7 @@
         </w:tc>
         <w:tc>
           <w:tcPr>
-            <w:tcW w:w="3985" w:type="dxa"/>
+            <w:tcW w:w="3467" w:type="dxa"/>
             <w:tcBorders>
               <w:top w:val="nil"/>
               <w:left w:val="nil"/>
@@ -10979,7 +10979,7 @@
         </w:trPr>
         <w:tc>
           <w:tcPr>
-            <w:tcW w:w="323" w:type="dxa"/>
+            <w:tcW w:w="440" w:type="dxa"/>
             <w:tcBorders>
               <w:top w:val="nil"/>
               <w:left w:val="single" w:sz="4" w:space="0" w:color="auto"/>
@@ -11015,7 +11015,7 @@
         </w:tc>
         <w:tc>
           <w:tcPr>
-            <w:tcW w:w="1860" w:type="dxa"/>
+            <w:tcW w:w="1687" w:type="dxa"/>
             <w:tcBorders>
               <w:top w:val="nil"/>
               <w:left w:val="nil"/>
@@ -11049,7 +11049,7 @@
         </w:tc>
         <w:tc>
           <w:tcPr>
-            <w:tcW w:w="1320" w:type="dxa"/>
+            <w:tcW w:w="1197" w:type="dxa"/>
             <w:tcBorders>
               <w:top w:val="nil"/>
               <w:left w:val="nil"/>
@@ -11083,7 +11083,7 @@
         </w:tc>
         <w:tc>
           <w:tcPr>
-            <w:tcW w:w="1125" w:type="dxa"/>
+            <w:tcW w:w="1020" w:type="dxa"/>
             <w:tcBorders>
               <w:top w:val="nil"/>
               <w:left w:val="nil"/>
@@ -11118,7 +11118,7 @@
         </w:tc>
         <w:tc>
           <w:tcPr>
-            <w:tcW w:w="795" w:type="dxa"/>
+            <w:tcW w:w="721" w:type="dxa"/>
             <w:tcBorders>
               <w:top w:val="nil"/>
               <w:left w:val="nil"/>
@@ -11153,7 +11153,7 @@
         </w:tc>
         <w:tc>
           <w:tcPr>
-            <w:tcW w:w="906" w:type="dxa"/>
+            <w:tcW w:w="822" w:type="dxa"/>
             <w:tcBorders>
               <w:top w:val="nil"/>
               <w:left w:val="nil"/>
@@ -11188,7 +11188,7 @@
         </w:tc>
         <w:tc>
           <w:tcPr>
-            <w:tcW w:w="3985" w:type="dxa"/>
+            <w:tcW w:w="3467" w:type="dxa"/>
             <w:tcBorders>
               <w:top w:val="nil"/>
               <w:left w:val="nil"/>
@@ -11240,7 +11240,7 @@
         </w:trPr>
         <w:tc>
           <w:tcPr>
-            <w:tcW w:w="323" w:type="dxa"/>
+            <w:tcW w:w="440" w:type="dxa"/>
             <w:tcBorders>
               <w:top w:val="nil"/>
               <w:left w:val="single" w:sz="4" w:space="0" w:color="auto"/>
@@ -11276,7 +11276,7 @@
         </w:tc>
         <w:tc>
           <w:tcPr>
-            <w:tcW w:w="1860" w:type="dxa"/>
+            <w:tcW w:w="1687" w:type="dxa"/>
             <w:tcBorders>
               <w:top w:val="nil"/>
               <w:left w:val="nil"/>
@@ -11310,7 +11310,7 @@
         </w:tc>
         <w:tc>
           <w:tcPr>
-            <w:tcW w:w="1320" w:type="dxa"/>
+            <w:tcW w:w="1197" w:type="dxa"/>
             <w:tcBorders>
               <w:top w:val="nil"/>
               <w:left w:val="nil"/>
@@ -11344,7 +11344,7 @@
         </w:tc>
         <w:tc>
           <w:tcPr>
-            <w:tcW w:w="1125" w:type="dxa"/>
+            <w:tcW w:w="1020" w:type="dxa"/>
             <w:tcBorders>
               <w:top w:val="nil"/>
               <w:left w:val="nil"/>
@@ -11379,7 +11379,7 @@
         </w:tc>
         <w:tc>
           <w:tcPr>
-            <w:tcW w:w="795" w:type="dxa"/>
+            <w:tcW w:w="721" w:type="dxa"/>
             <w:tcBorders>
               <w:top w:val="nil"/>
               <w:left w:val="nil"/>
@@ -11414,7 +11414,7 @@
         </w:tc>
         <w:tc>
           <w:tcPr>
-            <w:tcW w:w="906" w:type="dxa"/>
+            <w:tcW w:w="822" w:type="dxa"/>
             <w:tcBorders>
               <w:top w:val="nil"/>
               <w:left w:val="nil"/>
@@ -11449,7 +11449,7 @@
         </w:tc>
         <w:tc>
           <w:tcPr>
-            <w:tcW w:w="3985" w:type="dxa"/>
+            <w:tcW w:w="3467" w:type="dxa"/>
             <w:tcBorders>
               <w:top w:val="nil"/>
               <w:left w:val="nil"/>
@@ -11513,7 +11513,7 @@
         </w:trPr>
         <w:tc>
           <w:tcPr>
-            <w:tcW w:w="323" w:type="dxa"/>
+            <w:tcW w:w="440" w:type="dxa"/>
             <w:tcBorders>
               <w:top w:val="nil"/>
               <w:left w:val="single" w:sz="4" w:space="0" w:color="auto"/>
@@ -11550,7 +11550,7 @@
         </w:tc>
         <w:tc>
           <w:tcPr>
-            <w:tcW w:w="1860" w:type="dxa"/>
+            <w:tcW w:w="1687" w:type="dxa"/>
             <w:tcBorders>
               <w:top w:val="nil"/>
               <w:left w:val="nil"/>
@@ -11585,7 +11585,7 @@
         </w:tc>
         <w:tc>
           <w:tcPr>
-            <w:tcW w:w="1320" w:type="dxa"/>
+            <w:tcW w:w="1197" w:type="dxa"/>
             <w:tcBorders>
               <w:top w:val="nil"/>
               <w:left w:val="nil"/>
@@ -11620,7 +11620,7 @@
         </w:tc>
         <w:tc>
           <w:tcPr>
-            <w:tcW w:w="1125" w:type="dxa"/>
+            <w:tcW w:w="1020" w:type="dxa"/>
             <w:tcBorders>
               <w:top w:val="nil"/>
               <w:left w:val="nil"/>
@@ -11656,7 +11656,7 @@
         </w:tc>
         <w:tc>
           <w:tcPr>
-            <w:tcW w:w="795" w:type="dxa"/>
+            <w:tcW w:w="721" w:type="dxa"/>
             <w:tcBorders>
               <w:top w:val="nil"/>
               <w:left w:val="nil"/>
@@ -11692,7 +11692,7 @@
         </w:tc>
         <w:tc>
           <w:tcPr>
-            <w:tcW w:w="906" w:type="dxa"/>
+            <w:tcW w:w="822" w:type="dxa"/>
             <w:tcBorders>
               <w:top w:val="nil"/>
               <w:left w:val="nil"/>
@@ -11728,7 +11728,7 @@
         </w:tc>
         <w:tc>
           <w:tcPr>
-            <w:tcW w:w="3985" w:type="dxa"/>
+            <w:tcW w:w="3467" w:type="dxa"/>
             <w:tcBorders>
               <w:top w:val="nil"/>
               <w:left w:val="nil"/>
@@ -11878,7 +11878,7 @@
         </w:trPr>
         <w:tc>
           <w:tcPr>
-            <w:tcW w:w="323" w:type="dxa"/>
+            <w:tcW w:w="440" w:type="dxa"/>
             <w:tcBorders>
               <w:top w:val="nil"/>
               <w:left w:val="single" w:sz="4" w:space="0" w:color="auto"/>
@@ -11915,7 +11915,7 @@
         </w:tc>
         <w:tc>
           <w:tcPr>
-            <w:tcW w:w="1860" w:type="dxa"/>
+            <w:tcW w:w="1687" w:type="dxa"/>
             <w:tcBorders>
               <w:top w:val="nil"/>
               <w:left w:val="nil"/>
@@ -11950,7 +11950,7 @@
         </w:tc>
         <w:tc>
           <w:tcPr>
-            <w:tcW w:w="1320" w:type="dxa"/>
+            <w:tcW w:w="1197" w:type="dxa"/>
             <w:tcBorders>
               <w:top w:val="nil"/>
               <w:left w:val="nil"/>
@@ -11985,7 +11985,7 @@
         </w:tc>
         <w:tc>
           <w:tcPr>
-            <w:tcW w:w="1125" w:type="dxa"/>
+            <w:tcW w:w="1020" w:type="dxa"/>
             <w:tcBorders>
               <w:top w:val="nil"/>
               <w:left w:val="nil"/>
@@ -12021,7 +12021,7 @@
         </w:tc>
         <w:tc>
           <w:tcPr>
-            <w:tcW w:w="795" w:type="dxa"/>
+            <w:tcW w:w="721" w:type="dxa"/>
             <w:tcBorders>
               <w:top w:val="nil"/>
               <w:left w:val="nil"/>
@@ -12057,7 +12057,7 @@
         </w:tc>
         <w:tc>
           <w:tcPr>
-            <w:tcW w:w="906" w:type="dxa"/>
+            <w:tcW w:w="822" w:type="dxa"/>
             <w:tcBorders>
               <w:top w:val="nil"/>
               <w:left w:val="nil"/>
@@ -12093,7 +12093,7 @@
         </w:tc>
         <w:tc>
           <w:tcPr>
-            <w:tcW w:w="3985" w:type="dxa"/>
+            <w:tcW w:w="3467" w:type="dxa"/>
             <w:tcBorders>
               <w:top w:val="nil"/>
               <w:left w:val="nil"/>
@@ -12344,7 +12344,7 @@
     <w:p/>
     <w:tbl>
       <w:tblPr>
-        <w:tblW w:w="9854" w:type="dxa"/>
+        <w:tblW w:w="9355" w:type="dxa"/>
         <w:tblCellMar>
           <w:left w:w="70" w:type="dxa"/>
           <w:right w:w="70" w:type="dxa"/>
@@ -12352,13 +12352,13 @@
         <w:tblLook w:val="04A0" w:firstRow="1" w:lastRow="0" w:firstColumn="1" w:lastColumn="0" w:noHBand="0" w:noVBand="1"/>
       </w:tblPr>
       <w:tblGrid>
-        <w:gridCol w:w="323"/>
-        <w:gridCol w:w="1860"/>
-        <w:gridCol w:w="1320"/>
-        <w:gridCol w:w="1125"/>
-        <w:gridCol w:w="795"/>
-        <w:gridCol w:w="906"/>
-        <w:gridCol w:w="3525"/>
+        <w:gridCol w:w="440"/>
+        <w:gridCol w:w="1766"/>
+        <w:gridCol w:w="1253"/>
+        <w:gridCol w:w="1068"/>
+        <w:gridCol w:w="755"/>
+        <w:gridCol w:w="860"/>
+        <w:gridCol w:w="3213"/>
       </w:tblGrid>
       <w:tr>
         <w:trPr>
@@ -12367,7 +12367,7 @@
         </w:trPr>
         <w:tc>
           <w:tcPr>
-            <w:tcW w:w="323" w:type="dxa"/>
+            <w:tcW w:w="440" w:type="dxa"/>
             <w:tcBorders>
               <w:top w:val="single" w:sz="4" w:space="0" w:color="auto"/>
               <w:left w:val="single" w:sz="4" w:space="0" w:color="auto"/>
@@ -12408,7 +12408,7 @@
         </w:tc>
         <w:tc>
           <w:tcPr>
-            <w:tcW w:w="1860" w:type="dxa"/>
+            <w:tcW w:w="1766" w:type="dxa"/>
             <w:tcBorders>
               <w:top w:val="single" w:sz="4" w:space="0" w:color="auto"/>
               <w:left w:val="nil"/>
@@ -12450,7 +12450,7 @@
         </w:tc>
         <w:tc>
           <w:tcPr>
-            <w:tcW w:w="1320" w:type="dxa"/>
+            <w:tcW w:w="1253" w:type="dxa"/>
             <w:tcBorders>
               <w:top w:val="single" w:sz="4" w:space="0" w:color="auto"/>
               <w:left w:val="nil"/>
@@ -12492,7 +12492,7 @@
         </w:tc>
         <w:tc>
           <w:tcPr>
-            <w:tcW w:w="1125" w:type="dxa"/>
+            <w:tcW w:w="1068" w:type="dxa"/>
             <w:tcBorders>
               <w:top w:val="single" w:sz="4" w:space="0" w:color="auto"/>
               <w:left w:val="nil"/>
@@ -12534,7 +12534,7 @@
         </w:tc>
         <w:tc>
           <w:tcPr>
-            <w:tcW w:w="795" w:type="dxa"/>
+            <w:tcW w:w="755" w:type="dxa"/>
             <w:tcBorders>
               <w:top w:val="single" w:sz="4" w:space="0" w:color="auto"/>
               <w:left w:val="nil"/>
@@ -12575,7 +12575,7 @@
         </w:tc>
         <w:tc>
           <w:tcPr>
-            <w:tcW w:w="906" w:type="dxa"/>
+            <w:tcW w:w="860" w:type="dxa"/>
             <w:tcBorders>
               <w:top w:val="single" w:sz="4" w:space="0" w:color="auto"/>
               <w:left w:val="nil"/>
@@ -12616,7 +12616,7 @@
         </w:tc>
         <w:tc>
           <w:tcPr>
-            <w:tcW w:w="3525" w:type="dxa"/>
+            <w:tcW w:w="3213" w:type="dxa"/>
             <w:tcBorders>
               <w:top w:val="single" w:sz="4" w:space="0" w:color="auto"/>
               <w:left w:val="nil"/>
@@ -12663,7 +12663,7 @@
         </w:trPr>
         <w:tc>
           <w:tcPr>
-            <w:tcW w:w="323" w:type="dxa"/>
+            <w:tcW w:w="440" w:type="dxa"/>
             <w:tcBorders>
               <w:top w:val="nil"/>
               <w:left w:val="single" w:sz="4" w:space="0" w:color="auto"/>
@@ -12700,7 +12700,7 @@
         </w:tc>
         <w:tc>
           <w:tcPr>
-            <w:tcW w:w="1860" w:type="dxa"/>
+            <w:tcW w:w="1766" w:type="dxa"/>
             <w:tcBorders>
               <w:top w:val="nil"/>
               <w:left w:val="nil"/>
@@ -12736,7 +12736,7 @@
         </w:tc>
         <w:tc>
           <w:tcPr>
-            <w:tcW w:w="1320" w:type="dxa"/>
+            <w:tcW w:w="1253" w:type="dxa"/>
             <w:tcBorders>
               <w:top w:val="nil"/>
               <w:left w:val="nil"/>
@@ -12772,7 +12772,7 @@
         </w:tc>
         <w:tc>
           <w:tcPr>
-            <w:tcW w:w="1125" w:type="dxa"/>
+            <w:tcW w:w="1068" w:type="dxa"/>
             <w:tcBorders>
               <w:top w:val="nil"/>
               <w:left w:val="nil"/>
@@ -12808,7 +12808,7 @@
         </w:tc>
         <w:tc>
           <w:tcPr>
-            <w:tcW w:w="795" w:type="dxa"/>
+            <w:tcW w:w="755" w:type="dxa"/>
             <w:tcBorders>
               <w:top w:val="nil"/>
               <w:left w:val="nil"/>
@@ -12844,7 +12844,7 @@
         </w:tc>
         <w:tc>
           <w:tcPr>
-            <w:tcW w:w="906" w:type="dxa"/>
+            <w:tcW w:w="860" w:type="dxa"/>
             <w:tcBorders>
               <w:top w:val="nil"/>
               <w:left w:val="nil"/>
@@ -12880,7 +12880,7 @@
         </w:tc>
         <w:tc>
           <w:tcPr>
-            <w:tcW w:w="3525" w:type="dxa"/>
+            <w:tcW w:w="3213" w:type="dxa"/>
             <w:tcBorders>
               <w:top w:val="nil"/>
               <w:left w:val="nil"/>
@@ -12921,7 +12921,7 @@
         </w:trPr>
         <w:tc>
           <w:tcPr>
-            <w:tcW w:w="323" w:type="dxa"/>
+            <w:tcW w:w="440" w:type="dxa"/>
             <w:tcBorders>
               <w:top w:val="nil"/>
               <w:left w:val="single" w:sz="4" w:space="0" w:color="auto"/>
@@ -12959,7 +12959,7 @@
         </w:tc>
         <w:tc>
           <w:tcPr>
-            <w:tcW w:w="1860" w:type="dxa"/>
+            <w:tcW w:w="1766" w:type="dxa"/>
             <w:tcBorders>
               <w:top w:val="nil"/>
               <w:left w:val="nil"/>
@@ -12997,7 +12997,7 @@
         </w:tc>
         <w:tc>
           <w:tcPr>
-            <w:tcW w:w="1320" w:type="dxa"/>
+            <w:tcW w:w="1253" w:type="dxa"/>
             <w:tcBorders>
               <w:top w:val="nil"/>
               <w:left w:val="nil"/>
@@ -13034,7 +13034,7 @@
         </w:tc>
         <w:tc>
           <w:tcPr>
-            <w:tcW w:w="1125" w:type="dxa"/>
+            <w:tcW w:w="1068" w:type="dxa"/>
             <w:tcBorders>
               <w:top w:val="nil"/>
               <w:left w:val="nil"/>
@@ -13071,7 +13071,7 @@
         </w:tc>
         <w:tc>
           <w:tcPr>
-            <w:tcW w:w="795" w:type="dxa"/>
+            <w:tcW w:w="755" w:type="dxa"/>
             <w:vMerge w:val="restart"/>
             <w:tcBorders>
               <w:top w:val="nil"/>
@@ -13108,7 +13108,7 @@
         </w:tc>
         <w:tc>
           <w:tcPr>
-            <w:tcW w:w="906" w:type="dxa"/>
+            <w:tcW w:w="860" w:type="dxa"/>
             <w:vMerge w:val="restart"/>
             <w:tcBorders>
               <w:top w:val="nil"/>
@@ -13145,7 +13145,7 @@
         </w:tc>
         <w:tc>
           <w:tcPr>
-            <w:tcW w:w="3525" w:type="dxa"/>
+            <w:tcW w:w="3213" w:type="dxa"/>
             <w:tcBorders>
               <w:top w:val="nil"/>
               <w:left w:val="nil"/>
@@ -13187,7 +13187,7 @@
         </w:trPr>
         <w:tc>
           <w:tcPr>
-            <w:tcW w:w="323" w:type="dxa"/>
+            <w:tcW w:w="440" w:type="dxa"/>
             <w:tcBorders>
               <w:top w:val="nil"/>
               <w:left w:val="single" w:sz="4" w:space="0" w:color="auto"/>
@@ -13225,7 +13225,7 @@
         </w:tc>
         <w:tc>
           <w:tcPr>
-            <w:tcW w:w="1860" w:type="dxa"/>
+            <w:tcW w:w="1766" w:type="dxa"/>
             <w:tcBorders>
               <w:top w:val="nil"/>
               <w:left w:val="nil"/>
@@ -13262,7 +13262,7 @@
         </w:tc>
         <w:tc>
           <w:tcPr>
-            <w:tcW w:w="1320" w:type="dxa"/>
+            <w:tcW w:w="1253" w:type="dxa"/>
             <w:tcBorders>
               <w:top w:val="nil"/>
               <w:left w:val="nil"/>
@@ -13300,7 +13300,7 @@
         </w:tc>
         <w:tc>
           <w:tcPr>
-            <w:tcW w:w="1125" w:type="dxa"/>
+            <w:tcW w:w="1068" w:type="dxa"/>
             <w:tcBorders>
               <w:top w:val="nil"/>
               <w:left w:val="nil"/>
@@ -13337,7 +13337,7 @@
         </w:tc>
         <w:tc>
           <w:tcPr>
-            <w:tcW w:w="795" w:type="dxa"/>
+            <w:tcW w:w="755" w:type="dxa"/>
             <w:vMerge/>
             <w:tcBorders>
               <w:top w:val="nil"/>
@@ -13364,7 +13364,7 @@
         </w:tc>
         <w:tc>
           <w:tcPr>
-            <w:tcW w:w="906" w:type="dxa"/>
+            <w:tcW w:w="860" w:type="dxa"/>
             <w:vMerge/>
             <w:tcBorders>
               <w:top w:val="nil"/>
@@ -13391,7 +13391,7 @@
         </w:tc>
         <w:tc>
           <w:tcPr>
-            <w:tcW w:w="3525" w:type="dxa"/>
+            <w:tcW w:w="3213" w:type="dxa"/>
             <w:tcBorders>
               <w:top w:val="nil"/>
               <w:left w:val="nil"/>
@@ -13433,7 +13433,7 @@
         </w:trPr>
         <w:tc>
           <w:tcPr>
-            <w:tcW w:w="323" w:type="dxa"/>
+            <w:tcW w:w="440" w:type="dxa"/>
             <w:tcBorders>
               <w:top w:val="nil"/>
               <w:left w:val="single" w:sz="4" w:space="0" w:color="auto"/>
@@ -13471,7 +13471,7 @@
         </w:tc>
         <w:tc>
           <w:tcPr>
-            <w:tcW w:w="1860" w:type="dxa"/>
+            <w:tcW w:w="1766" w:type="dxa"/>
             <w:tcBorders>
               <w:top w:val="nil"/>
               <w:left w:val="nil"/>
@@ -13508,7 +13508,7 @@
         </w:tc>
         <w:tc>
           <w:tcPr>
-            <w:tcW w:w="1320" w:type="dxa"/>
+            <w:tcW w:w="1253" w:type="dxa"/>
             <w:tcBorders>
               <w:top w:val="nil"/>
               <w:left w:val="nil"/>
@@ -13546,7 +13546,7 @@
         </w:tc>
         <w:tc>
           <w:tcPr>
-            <w:tcW w:w="1125" w:type="dxa"/>
+            <w:tcW w:w="1068" w:type="dxa"/>
             <w:tcBorders>
               <w:top w:val="nil"/>
               <w:left w:val="nil"/>
@@ -13583,7 +13583,7 @@
         </w:tc>
         <w:tc>
           <w:tcPr>
-            <w:tcW w:w="795" w:type="dxa"/>
+            <w:tcW w:w="755" w:type="dxa"/>
             <w:vMerge/>
             <w:tcBorders>
               <w:top w:val="nil"/>
@@ -13610,7 +13610,7 @@
         </w:tc>
         <w:tc>
           <w:tcPr>
-            <w:tcW w:w="906" w:type="dxa"/>
+            <w:tcW w:w="860" w:type="dxa"/>
             <w:vMerge/>
             <w:tcBorders>
               <w:top w:val="nil"/>
@@ -13637,7 +13637,7 @@
         </w:tc>
         <w:tc>
           <w:tcPr>
-            <w:tcW w:w="3525" w:type="dxa"/>
+            <w:tcW w:w="3213" w:type="dxa"/>
             <w:tcBorders>
               <w:top w:val="nil"/>
               <w:left w:val="nil"/>
@@ -13679,7 +13679,7 @@
         </w:trPr>
         <w:tc>
           <w:tcPr>
-            <w:tcW w:w="323" w:type="dxa"/>
+            <w:tcW w:w="440" w:type="dxa"/>
             <w:tcBorders>
               <w:top w:val="nil"/>
               <w:left w:val="single" w:sz="4" w:space="0" w:color="auto"/>
@@ -13717,7 +13717,7 @@
         </w:tc>
         <w:tc>
           <w:tcPr>
-            <w:tcW w:w="1860" w:type="dxa"/>
+            <w:tcW w:w="1766" w:type="dxa"/>
             <w:tcBorders>
               <w:top w:val="nil"/>
               <w:left w:val="nil"/>
@@ -13754,7 +13754,7 @@
         </w:tc>
         <w:tc>
           <w:tcPr>
-            <w:tcW w:w="1320" w:type="dxa"/>
+            <w:tcW w:w="1253" w:type="dxa"/>
             <w:tcBorders>
               <w:top w:val="nil"/>
               <w:left w:val="nil"/>
@@ -13792,7 +13792,7 @@
         </w:tc>
         <w:tc>
           <w:tcPr>
-            <w:tcW w:w="1125" w:type="dxa"/>
+            <w:tcW w:w="1068" w:type="dxa"/>
             <w:tcBorders>
               <w:top w:val="nil"/>
               <w:left w:val="nil"/>
@@ -13829,7 +13829,7 @@
         </w:tc>
         <w:tc>
           <w:tcPr>
-            <w:tcW w:w="795" w:type="dxa"/>
+            <w:tcW w:w="755" w:type="dxa"/>
             <w:vMerge/>
             <w:tcBorders>
               <w:top w:val="nil"/>
@@ -13856,7 +13856,7 @@
         </w:tc>
         <w:tc>
           <w:tcPr>
-            <w:tcW w:w="906" w:type="dxa"/>
+            <w:tcW w:w="860" w:type="dxa"/>
             <w:vMerge/>
             <w:tcBorders>
               <w:top w:val="nil"/>
@@ -13883,7 +13883,7 @@
         </w:tc>
         <w:tc>
           <w:tcPr>
-            <w:tcW w:w="3525" w:type="dxa"/>
+            <w:tcW w:w="3213" w:type="dxa"/>
             <w:tcBorders>
               <w:top w:val="nil"/>
               <w:left w:val="nil"/>
@@ -13925,7 +13925,7 @@
         </w:trPr>
         <w:tc>
           <w:tcPr>
-            <w:tcW w:w="323" w:type="dxa"/>
+            <w:tcW w:w="440" w:type="dxa"/>
             <w:tcBorders>
               <w:top w:val="nil"/>
               <w:left w:val="single" w:sz="4" w:space="0" w:color="auto"/>
@@ -13963,7 +13963,7 @@
         </w:tc>
         <w:tc>
           <w:tcPr>
-            <w:tcW w:w="1860" w:type="dxa"/>
+            <w:tcW w:w="1766" w:type="dxa"/>
             <w:tcBorders>
               <w:top w:val="nil"/>
               <w:left w:val="nil"/>
@@ -14000,7 +14000,7 @@
         </w:tc>
         <w:tc>
           <w:tcPr>
-            <w:tcW w:w="1320" w:type="dxa"/>
+            <w:tcW w:w="1253" w:type="dxa"/>
             <w:tcBorders>
               <w:top w:val="nil"/>
               <w:left w:val="nil"/>
@@ -14038,7 +14038,7 @@
         </w:tc>
         <w:tc>
           <w:tcPr>
-            <w:tcW w:w="1125" w:type="dxa"/>
+            <w:tcW w:w="1068" w:type="dxa"/>
             <w:tcBorders>
               <w:top w:val="nil"/>
               <w:left w:val="nil"/>
@@ -14075,7 +14075,7 @@
         </w:tc>
         <w:tc>
           <w:tcPr>
-            <w:tcW w:w="795" w:type="dxa"/>
+            <w:tcW w:w="755" w:type="dxa"/>
             <w:vMerge/>
             <w:tcBorders>
               <w:top w:val="nil"/>
@@ -14102,7 +14102,7 @@
         </w:tc>
         <w:tc>
           <w:tcPr>
-            <w:tcW w:w="906" w:type="dxa"/>
+            <w:tcW w:w="860" w:type="dxa"/>
             <w:vMerge/>
             <w:tcBorders>
               <w:top w:val="nil"/>
@@ -14129,7 +14129,7 @@
         </w:tc>
         <w:tc>
           <w:tcPr>
-            <w:tcW w:w="3525" w:type="dxa"/>
+            <w:tcW w:w="3213" w:type="dxa"/>
             <w:tcBorders>
               <w:top w:val="nil"/>
               <w:left w:val="nil"/>
@@ -14171,7 +14171,7 @@
         </w:trPr>
         <w:tc>
           <w:tcPr>
-            <w:tcW w:w="323" w:type="dxa"/>
+            <w:tcW w:w="440" w:type="dxa"/>
             <w:tcBorders>
               <w:top w:val="nil"/>
               <w:left w:val="single" w:sz="4" w:space="0" w:color="auto"/>
@@ -14209,7 +14209,7 @@
         </w:tc>
         <w:tc>
           <w:tcPr>
-            <w:tcW w:w="1860" w:type="dxa"/>
+            <w:tcW w:w="1766" w:type="dxa"/>
             <w:tcBorders>
               <w:top w:val="nil"/>
               <w:left w:val="nil"/>
@@ -14246,7 +14246,7 @@
         </w:tc>
         <w:tc>
           <w:tcPr>
-            <w:tcW w:w="1320" w:type="dxa"/>
+            <w:tcW w:w="1253" w:type="dxa"/>
             <w:tcBorders>
               <w:top w:val="nil"/>
               <w:left w:val="nil"/>
@@ -14284,7 +14284,7 @@
         </w:tc>
         <w:tc>
           <w:tcPr>
-            <w:tcW w:w="1125" w:type="dxa"/>
+            <w:tcW w:w="1068" w:type="dxa"/>
             <w:tcBorders>
               <w:top w:val="nil"/>
               <w:left w:val="nil"/>
@@ -14321,7 +14321,7 @@
         </w:tc>
         <w:tc>
           <w:tcPr>
-            <w:tcW w:w="795" w:type="dxa"/>
+            <w:tcW w:w="755" w:type="dxa"/>
             <w:vMerge/>
             <w:tcBorders>
               <w:top w:val="nil"/>
@@ -14348,7 +14348,7 @@
         </w:tc>
         <w:tc>
           <w:tcPr>
-            <w:tcW w:w="906" w:type="dxa"/>
+            <w:tcW w:w="860" w:type="dxa"/>
             <w:vMerge/>
             <w:tcBorders>
               <w:top w:val="nil"/>
@@ -14375,7 +14375,7 @@
         </w:tc>
         <w:tc>
           <w:tcPr>
-            <w:tcW w:w="3525" w:type="dxa"/>
+            <w:tcW w:w="3213" w:type="dxa"/>
             <w:tcBorders>
               <w:top w:val="nil"/>
               <w:left w:val="nil"/>
@@ -14417,7 +14417,7 @@
         </w:trPr>
         <w:tc>
           <w:tcPr>
-            <w:tcW w:w="323" w:type="dxa"/>
+            <w:tcW w:w="440" w:type="dxa"/>
             <w:tcBorders>
               <w:top w:val="nil"/>
               <w:left w:val="single" w:sz="4" w:space="0" w:color="auto"/>
@@ -14455,7 +14455,7 @@
         </w:tc>
         <w:tc>
           <w:tcPr>
-            <w:tcW w:w="1860" w:type="dxa"/>
+            <w:tcW w:w="1766" w:type="dxa"/>
             <w:tcBorders>
               <w:top w:val="nil"/>
               <w:left w:val="nil"/>
@@ -14492,7 +14492,7 @@
         </w:tc>
         <w:tc>
           <w:tcPr>
-            <w:tcW w:w="1320" w:type="dxa"/>
+            <w:tcW w:w="1253" w:type="dxa"/>
             <w:tcBorders>
               <w:top w:val="nil"/>
               <w:left w:val="nil"/>
@@ -14530,7 +14530,7 @@
         </w:tc>
         <w:tc>
           <w:tcPr>
-            <w:tcW w:w="1125" w:type="dxa"/>
+            <w:tcW w:w="1068" w:type="dxa"/>
             <w:tcBorders>
               <w:top w:val="nil"/>
               <w:left w:val="nil"/>
@@ -14567,7 +14567,7 @@
         </w:tc>
         <w:tc>
           <w:tcPr>
-            <w:tcW w:w="795" w:type="dxa"/>
+            <w:tcW w:w="755" w:type="dxa"/>
             <w:vMerge/>
             <w:tcBorders>
               <w:top w:val="nil"/>
@@ -14594,7 +14594,7 @@
         </w:tc>
         <w:tc>
           <w:tcPr>
-            <w:tcW w:w="906" w:type="dxa"/>
+            <w:tcW w:w="860" w:type="dxa"/>
             <w:vMerge/>
             <w:tcBorders>
               <w:top w:val="nil"/>
@@ -14621,7 +14621,7 @@
         </w:tc>
         <w:tc>
           <w:tcPr>
-            <w:tcW w:w="3525" w:type="dxa"/>
+            <w:tcW w:w="3213" w:type="dxa"/>
             <w:tcBorders>
               <w:top w:val="nil"/>
               <w:left w:val="nil"/>
@@ -14663,7 +14663,7 @@
         </w:trPr>
         <w:tc>
           <w:tcPr>
-            <w:tcW w:w="323" w:type="dxa"/>
+            <w:tcW w:w="440" w:type="dxa"/>
             <w:tcBorders>
               <w:top w:val="nil"/>
               <w:left w:val="single" w:sz="4" w:space="0" w:color="auto"/>
@@ -14701,7 +14701,7 @@
         </w:tc>
         <w:tc>
           <w:tcPr>
-            <w:tcW w:w="1860" w:type="dxa"/>
+            <w:tcW w:w="1766" w:type="dxa"/>
             <w:tcBorders>
               <w:top w:val="nil"/>
               <w:left w:val="nil"/>
@@ -14738,7 +14738,7 @@
         </w:tc>
         <w:tc>
           <w:tcPr>
-            <w:tcW w:w="1320" w:type="dxa"/>
+            <w:tcW w:w="1253" w:type="dxa"/>
             <w:tcBorders>
               <w:top w:val="nil"/>
               <w:left w:val="nil"/>
@@ -14776,7 +14776,7 @@
         </w:tc>
         <w:tc>
           <w:tcPr>
-            <w:tcW w:w="1125" w:type="dxa"/>
+            <w:tcW w:w="1068" w:type="dxa"/>
             <w:tcBorders>
               <w:top w:val="nil"/>
               <w:left w:val="nil"/>
@@ -14813,7 +14813,7 @@
         </w:tc>
         <w:tc>
           <w:tcPr>
-            <w:tcW w:w="795" w:type="dxa"/>
+            <w:tcW w:w="755" w:type="dxa"/>
             <w:vMerge/>
             <w:tcBorders>
               <w:top w:val="nil"/>
@@ -14840,7 +14840,7 @@
         </w:tc>
         <w:tc>
           <w:tcPr>
-            <w:tcW w:w="906" w:type="dxa"/>
+            <w:tcW w:w="860" w:type="dxa"/>
             <w:vMerge/>
             <w:tcBorders>
               <w:top w:val="nil"/>
@@ -14867,7 +14867,7 @@
         </w:tc>
         <w:tc>
           <w:tcPr>
-            <w:tcW w:w="3525" w:type="dxa"/>
+            <w:tcW w:w="3213" w:type="dxa"/>
             <w:tcBorders>
               <w:top w:val="nil"/>
               <w:left w:val="nil"/>
@@ -14909,7 +14909,7 @@
         </w:trPr>
         <w:tc>
           <w:tcPr>
-            <w:tcW w:w="323" w:type="dxa"/>
+            <w:tcW w:w="440" w:type="dxa"/>
             <w:tcBorders>
               <w:top w:val="nil"/>
               <w:left w:val="single" w:sz="4" w:space="0" w:color="auto"/>
@@ -14947,7 +14947,7 @@
         </w:tc>
         <w:tc>
           <w:tcPr>
-            <w:tcW w:w="1860" w:type="dxa"/>
+            <w:tcW w:w="1766" w:type="dxa"/>
             <w:tcBorders>
               <w:top w:val="nil"/>
               <w:left w:val="nil"/>
@@ -14984,7 +14984,7 @@
         </w:tc>
         <w:tc>
           <w:tcPr>
-            <w:tcW w:w="1320" w:type="dxa"/>
+            <w:tcW w:w="1253" w:type="dxa"/>
             <w:tcBorders>
               <w:top w:val="nil"/>
               <w:left w:val="nil"/>
@@ -15022,7 +15022,7 @@
         </w:tc>
         <w:tc>
           <w:tcPr>
-            <w:tcW w:w="1125" w:type="dxa"/>
+            <w:tcW w:w="1068" w:type="dxa"/>
             <w:tcBorders>
               <w:top w:val="nil"/>
               <w:left w:val="nil"/>
@@ -15059,7 +15059,7 @@
         </w:tc>
         <w:tc>
           <w:tcPr>
-            <w:tcW w:w="795" w:type="dxa"/>
+            <w:tcW w:w="755" w:type="dxa"/>
             <w:vMerge/>
             <w:tcBorders>
               <w:top w:val="nil"/>
@@ -15086,7 +15086,7 @@
         </w:tc>
         <w:tc>
           <w:tcPr>
-            <w:tcW w:w="906" w:type="dxa"/>
+            <w:tcW w:w="860" w:type="dxa"/>
             <w:vMerge/>
             <w:tcBorders>
               <w:top w:val="nil"/>
@@ -15113,7 +15113,7 @@
         </w:tc>
         <w:tc>
           <w:tcPr>
-            <w:tcW w:w="3525" w:type="dxa"/>
+            <w:tcW w:w="3213" w:type="dxa"/>
             <w:tcBorders>
               <w:top w:val="nil"/>
               <w:left w:val="nil"/>
@@ -15155,7 +15155,7 @@
         </w:trPr>
         <w:tc>
           <w:tcPr>
-            <w:tcW w:w="323" w:type="dxa"/>
+            <w:tcW w:w="440" w:type="dxa"/>
             <w:tcBorders>
               <w:top w:val="nil"/>
               <w:left w:val="single" w:sz="4" w:space="0" w:color="auto"/>
@@ -15192,7 +15192,7 @@
         </w:tc>
         <w:tc>
           <w:tcPr>
-            <w:tcW w:w="1860" w:type="dxa"/>
+            <w:tcW w:w="1766" w:type="dxa"/>
             <w:tcBorders>
               <w:top w:val="nil"/>
               <w:left w:val="nil"/>
@@ -15228,7 +15228,7 @@
         </w:tc>
         <w:tc>
           <w:tcPr>
-            <w:tcW w:w="1320" w:type="dxa"/>
+            <w:tcW w:w="1253" w:type="dxa"/>
             <w:tcBorders>
               <w:top w:val="single" w:sz="4" w:space="0" w:color="auto"/>
               <w:left w:val="nil"/>
@@ -15264,7 +15264,7 @@
         </w:tc>
         <w:tc>
           <w:tcPr>
-            <w:tcW w:w="1125" w:type="dxa"/>
+            <w:tcW w:w="1068" w:type="dxa"/>
             <w:tcBorders>
               <w:top w:val="nil"/>
               <w:left w:val="nil"/>
@@ -15300,7 +15300,7 @@
         </w:tc>
         <w:tc>
           <w:tcPr>
-            <w:tcW w:w="795" w:type="dxa"/>
+            <w:tcW w:w="755" w:type="dxa"/>
             <w:tcBorders>
               <w:top w:val="nil"/>
               <w:left w:val="nil"/>
@@ -15336,7 +15336,7 @@
         </w:tc>
         <w:tc>
           <w:tcPr>
-            <w:tcW w:w="906" w:type="dxa"/>
+            <w:tcW w:w="860" w:type="dxa"/>
             <w:tcBorders>
               <w:top w:val="nil"/>
               <w:left w:val="nil"/>
@@ -15372,7 +15372,7 @@
         </w:tc>
         <w:tc>
           <w:tcPr>
-            <w:tcW w:w="3525" w:type="dxa"/>
+            <w:tcW w:w="3213" w:type="dxa"/>
             <w:tcBorders>
               <w:top w:val="nil"/>
               <w:left w:val="nil"/>
@@ -15412,7 +15412,7 @@
         </w:trPr>
         <w:tc>
           <w:tcPr>
-            <w:tcW w:w="323" w:type="dxa"/>
+            <w:tcW w:w="440" w:type="dxa"/>
             <w:tcBorders>
               <w:top w:val="nil"/>
               <w:left w:val="single" w:sz="4" w:space="0" w:color="auto"/>
@@ -15449,7 +15449,7 @@
         </w:tc>
         <w:tc>
           <w:tcPr>
-            <w:tcW w:w="1860" w:type="dxa"/>
+            <w:tcW w:w="1766" w:type="dxa"/>
             <w:tcBorders>
               <w:top w:val="single" w:sz="4" w:space="0" w:color="auto"/>
               <w:left w:val="nil"/>
@@ -15485,7 +15485,7 @@
         </w:tc>
         <w:tc>
           <w:tcPr>
-            <w:tcW w:w="1320" w:type="dxa"/>
+            <w:tcW w:w="1253" w:type="dxa"/>
             <w:tcBorders>
               <w:top w:val="nil"/>
               <w:left w:val="nil"/>
@@ -15521,7 +15521,7 @@
         </w:tc>
         <w:tc>
           <w:tcPr>
-            <w:tcW w:w="1125" w:type="dxa"/>
+            <w:tcW w:w="1068" w:type="dxa"/>
             <w:tcBorders>
               <w:top w:val="nil"/>
               <w:left w:val="nil"/>
@@ -15557,7 +15557,7 @@
         </w:tc>
         <w:tc>
           <w:tcPr>
-            <w:tcW w:w="795" w:type="dxa"/>
+            <w:tcW w:w="755" w:type="dxa"/>
             <w:tcBorders>
               <w:top w:val="nil"/>
               <w:left w:val="nil"/>
@@ -15593,7 +15593,7 @@
         </w:tc>
         <w:tc>
           <w:tcPr>
-            <w:tcW w:w="906" w:type="dxa"/>
+            <w:tcW w:w="860" w:type="dxa"/>
             <w:tcBorders>
               <w:top w:val="nil"/>
               <w:left w:val="nil"/>
@@ -15629,7 +15629,7 @@
         </w:tc>
         <w:tc>
           <w:tcPr>
-            <w:tcW w:w="3525" w:type="dxa"/>
+            <w:tcW w:w="3213" w:type="dxa"/>
             <w:tcBorders>
               <w:top w:val="nil"/>
               <w:left w:val="nil"/>
@@ -15669,7 +15669,7 @@
         </w:trPr>
         <w:tc>
           <w:tcPr>
-            <w:tcW w:w="323" w:type="dxa"/>
+            <w:tcW w:w="440" w:type="dxa"/>
             <w:tcBorders>
               <w:top w:val="nil"/>
               <w:left w:val="single" w:sz="4" w:space="0" w:color="auto"/>
@@ -15706,7 +15706,7 @@
         </w:tc>
         <w:tc>
           <w:tcPr>
-            <w:tcW w:w="1860" w:type="dxa"/>
+            <w:tcW w:w="1766" w:type="dxa"/>
             <w:tcBorders>
               <w:top w:val="nil"/>
               <w:left w:val="nil"/>
@@ -15742,7 +15742,7 @@
         </w:tc>
         <w:tc>
           <w:tcPr>
-            <w:tcW w:w="1320" w:type="dxa"/>
+            <w:tcW w:w="1253" w:type="dxa"/>
             <w:tcBorders>
               <w:top w:val="nil"/>
               <w:left w:val="nil"/>
@@ -15778,7 +15778,7 @@
         </w:tc>
         <w:tc>
           <w:tcPr>
-            <w:tcW w:w="1125" w:type="dxa"/>
+            <w:tcW w:w="1068" w:type="dxa"/>
             <w:tcBorders>
               <w:top w:val="nil"/>
               <w:left w:val="nil"/>
@@ -15814,7 +15814,7 @@
         </w:tc>
         <w:tc>
           <w:tcPr>
-            <w:tcW w:w="795" w:type="dxa"/>
+            <w:tcW w:w="755" w:type="dxa"/>
             <w:tcBorders>
               <w:top w:val="nil"/>
               <w:left w:val="nil"/>
@@ -15850,7 +15850,7 @@
         </w:tc>
         <w:tc>
           <w:tcPr>
-            <w:tcW w:w="906" w:type="dxa"/>
+            <w:tcW w:w="860" w:type="dxa"/>
             <w:tcBorders>
               <w:top w:val="nil"/>
               <w:left w:val="nil"/>
@@ -15886,7 +15886,7 @@
         </w:tc>
         <w:tc>
           <w:tcPr>
-            <w:tcW w:w="3525" w:type="dxa"/>
+            <w:tcW w:w="3213" w:type="dxa"/>
             <w:tcBorders>
               <w:top w:val="nil"/>
               <w:left w:val="nil"/>
@@ -15926,7 +15926,7 @@
         </w:trPr>
         <w:tc>
           <w:tcPr>
-            <w:tcW w:w="323" w:type="dxa"/>
+            <w:tcW w:w="440" w:type="dxa"/>
             <w:tcBorders>
               <w:top w:val="nil"/>
               <w:left w:val="single" w:sz="4" w:space="0" w:color="auto"/>
@@ -15962,7 +15962,7 @@
         </w:tc>
         <w:tc>
           <w:tcPr>
-            <w:tcW w:w="1860" w:type="dxa"/>
+            <w:tcW w:w="1766" w:type="dxa"/>
             <w:tcBorders>
               <w:top w:val="nil"/>
               <w:left w:val="nil"/>
@@ -15996,7 +15996,7 @@
         </w:tc>
         <w:tc>
           <w:tcPr>
-            <w:tcW w:w="1320" w:type="dxa"/>
+            <w:tcW w:w="1253" w:type="dxa"/>
             <w:tcBorders>
               <w:top w:val="nil"/>
               <w:left w:val="nil"/>
@@ -16031,7 +16031,7 @@
         </w:tc>
         <w:tc>
           <w:tcPr>
-            <w:tcW w:w="1125" w:type="dxa"/>
+            <w:tcW w:w="1068" w:type="dxa"/>
             <w:tcBorders>
               <w:top w:val="nil"/>
               <w:left w:val="nil"/>
@@ -16066,7 +16066,7 @@
         </w:tc>
         <w:tc>
           <w:tcPr>
-            <w:tcW w:w="795" w:type="dxa"/>
+            <w:tcW w:w="755" w:type="dxa"/>
             <w:tcBorders>
               <w:top w:val="nil"/>
               <w:left w:val="nil"/>
@@ -16101,7 +16101,7 @@
         </w:tc>
         <w:tc>
           <w:tcPr>
-            <w:tcW w:w="906" w:type="dxa"/>
+            <w:tcW w:w="860" w:type="dxa"/>
             <w:tcBorders>
               <w:top w:val="nil"/>
               <w:left w:val="nil"/>
@@ -16126,7 +16126,7 @@
         </w:tc>
         <w:tc>
           <w:tcPr>
-            <w:tcW w:w="3525" w:type="dxa"/>
+            <w:tcW w:w="3213" w:type="dxa"/>
             <w:tcBorders>
               <w:top w:val="nil"/>
               <w:left w:val="nil"/>
@@ -16165,7 +16165,7 @@
         </w:trPr>
         <w:tc>
           <w:tcPr>
-            <w:tcW w:w="323" w:type="dxa"/>
+            <w:tcW w:w="440" w:type="dxa"/>
             <w:tcBorders>
               <w:top w:val="nil"/>
               <w:left w:val="single" w:sz="4" w:space="0" w:color="auto"/>
@@ -16201,7 +16201,7 @@
         </w:tc>
         <w:tc>
           <w:tcPr>
-            <w:tcW w:w="1860" w:type="dxa"/>
+            <w:tcW w:w="1766" w:type="dxa"/>
             <w:tcBorders>
               <w:top w:val="nil"/>
               <w:left w:val="nil"/>
@@ -16238,7 +16238,7 @@
         </w:tc>
         <w:tc>
           <w:tcPr>
-            <w:tcW w:w="1320" w:type="dxa"/>
+            <w:tcW w:w="1253" w:type="dxa"/>
             <w:tcBorders>
               <w:top w:val="nil"/>
               <w:left w:val="nil"/>
@@ -16274,7 +16274,7 @@
         </w:tc>
         <w:tc>
           <w:tcPr>
-            <w:tcW w:w="1125" w:type="dxa"/>
+            <w:tcW w:w="1068" w:type="dxa"/>
             <w:tcBorders>
               <w:top w:val="nil"/>
               <w:left w:val="nil"/>
@@ -16310,7 +16310,7 @@
         </w:tc>
         <w:tc>
           <w:tcPr>
-            <w:tcW w:w="795" w:type="dxa"/>
+            <w:tcW w:w="755" w:type="dxa"/>
             <w:tcBorders>
               <w:top w:val="nil"/>
               <w:left w:val="nil"/>
@@ -16346,7 +16346,7 @@
         </w:tc>
         <w:tc>
           <w:tcPr>
-            <w:tcW w:w="906" w:type="dxa"/>
+            <w:tcW w:w="860" w:type="dxa"/>
             <w:tcBorders>
               <w:top w:val="nil"/>
               <w:left w:val="nil"/>
@@ -16382,7 +16382,7 @@
         </w:tc>
         <w:tc>
           <w:tcPr>
-            <w:tcW w:w="3525" w:type="dxa"/>
+            <w:tcW w:w="3213" w:type="dxa"/>
             <w:tcBorders>
               <w:top w:val="nil"/>
               <w:left w:val="nil"/>
@@ -16436,7 +16436,7 @@
         </w:trPr>
         <w:tc>
           <w:tcPr>
-            <w:tcW w:w="323" w:type="dxa"/>
+            <w:tcW w:w="440" w:type="dxa"/>
             <w:tcBorders>
               <w:top w:val="nil"/>
               <w:left w:val="single" w:sz="4" w:space="0" w:color="auto"/>
@@ -16472,7 +16472,7 @@
         </w:tc>
         <w:tc>
           <w:tcPr>
-            <w:tcW w:w="1860" w:type="dxa"/>
+            <w:tcW w:w="1766" w:type="dxa"/>
             <w:tcBorders>
               <w:top w:val="nil"/>
               <w:left w:val="nil"/>
@@ -16507,7 +16507,7 @@
         </w:tc>
         <w:tc>
           <w:tcPr>
-            <w:tcW w:w="1320" w:type="dxa"/>
+            <w:tcW w:w="1253" w:type="dxa"/>
             <w:tcBorders>
               <w:top w:val="nil"/>
               <w:left w:val="nil"/>
@@ -16543,7 +16543,7 @@
         </w:tc>
         <w:tc>
           <w:tcPr>
-            <w:tcW w:w="1125" w:type="dxa"/>
+            <w:tcW w:w="1068" w:type="dxa"/>
             <w:tcBorders>
               <w:top w:val="nil"/>
               <w:left w:val="nil"/>
@@ -16579,7 +16579,7 @@
         </w:tc>
         <w:tc>
           <w:tcPr>
-            <w:tcW w:w="795" w:type="dxa"/>
+            <w:tcW w:w="755" w:type="dxa"/>
             <w:tcBorders>
               <w:top w:val="nil"/>
               <w:left w:val="nil"/>
@@ -16615,7 +16615,7 @@
         </w:tc>
         <w:tc>
           <w:tcPr>
-            <w:tcW w:w="906" w:type="dxa"/>
+            <w:tcW w:w="860" w:type="dxa"/>
             <w:tcBorders>
               <w:top w:val="nil"/>
               <w:left w:val="nil"/>
@@ -16651,7 +16651,7 @@
         </w:tc>
         <w:tc>
           <w:tcPr>
-            <w:tcW w:w="3525" w:type="dxa"/>
+            <w:tcW w:w="3213" w:type="dxa"/>
             <w:tcBorders>
               <w:top w:val="nil"/>
               <w:left w:val="nil"/>
@@ -16704,7 +16704,7 @@
         </w:trPr>
         <w:tc>
           <w:tcPr>
-            <w:tcW w:w="323" w:type="dxa"/>
+            <w:tcW w:w="440" w:type="dxa"/>
             <w:tcBorders>
               <w:top w:val="nil"/>
               <w:left w:val="single" w:sz="4" w:space="0" w:color="auto"/>
@@ -16740,7 +16740,7 @@
         </w:tc>
         <w:tc>
           <w:tcPr>
-            <w:tcW w:w="1860" w:type="dxa"/>
+            <w:tcW w:w="1766" w:type="dxa"/>
             <w:tcBorders>
               <w:top w:val="nil"/>
               <w:left w:val="nil"/>
@@ -16775,7 +16775,7 @@
         </w:tc>
         <w:tc>
           <w:tcPr>
-            <w:tcW w:w="1320" w:type="dxa"/>
+            <w:tcW w:w="1253" w:type="dxa"/>
             <w:tcBorders>
               <w:top w:val="nil"/>
               <w:left w:val="nil"/>
@@ -16811,7 +16811,7 @@
         </w:tc>
         <w:tc>
           <w:tcPr>
-            <w:tcW w:w="1125" w:type="dxa"/>
+            <w:tcW w:w="1068" w:type="dxa"/>
             <w:tcBorders>
               <w:top w:val="nil"/>
               <w:left w:val="nil"/>
@@ -16847,7 +16847,7 @@
         </w:tc>
         <w:tc>
           <w:tcPr>
-            <w:tcW w:w="795" w:type="dxa"/>
+            <w:tcW w:w="755" w:type="dxa"/>
             <w:tcBorders>
               <w:top w:val="nil"/>
               <w:left w:val="nil"/>
@@ -16883,7 +16883,7 @@
         </w:tc>
         <w:tc>
           <w:tcPr>
-            <w:tcW w:w="906" w:type="dxa"/>
+            <w:tcW w:w="860" w:type="dxa"/>
             <w:tcBorders>
               <w:top w:val="nil"/>
               <w:left w:val="nil"/>
@@ -16919,7 +16919,7 @@
         </w:tc>
         <w:tc>
           <w:tcPr>
-            <w:tcW w:w="3525" w:type="dxa"/>
+            <w:tcW w:w="3213" w:type="dxa"/>
             <w:tcBorders>
               <w:top w:val="nil"/>
               <w:left w:val="nil"/>
@@ -16973,7 +16973,7 @@
         </w:trPr>
         <w:tc>
           <w:tcPr>
-            <w:tcW w:w="323" w:type="dxa"/>
+            <w:tcW w:w="440" w:type="dxa"/>
             <w:tcBorders>
               <w:top w:val="nil"/>
               <w:left w:val="single" w:sz="4" w:space="0" w:color="auto"/>
@@ -17009,7 +17009,7 @@
         </w:tc>
         <w:tc>
           <w:tcPr>
-            <w:tcW w:w="1860" w:type="dxa"/>
+            <w:tcW w:w="1766" w:type="dxa"/>
             <w:tcBorders>
               <w:top w:val="nil"/>
               <w:left w:val="nil"/>
@@ -17044,7 +17044,7 @@
         </w:tc>
         <w:tc>
           <w:tcPr>
-            <w:tcW w:w="1320" w:type="dxa"/>
+            <w:tcW w:w="1253" w:type="dxa"/>
             <w:tcBorders>
               <w:top w:val="nil"/>
               <w:left w:val="nil"/>
@@ -17080,7 +17080,7 @@
         </w:tc>
         <w:tc>
           <w:tcPr>
-            <w:tcW w:w="1125" w:type="dxa"/>
+            <w:tcW w:w="1068" w:type="dxa"/>
             <w:tcBorders>
               <w:top w:val="nil"/>
               <w:left w:val="nil"/>
@@ -17116,7 +17116,7 @@
         </w:tc>
         <w:tc>
           <w:tcPr>
-            <w:tcW w:w="795" w:type="dxa"/>
+            <w:tcW w:w="755" w:type="dxa"/>
             <w:tcBorders>
               <w:top w:val="nil"/>
               <w:left w:val="nil"/>
@@ -17152,7 +17152,7 @@
         </w:tc>
         <w:tc>
           <w:tcPr>
-            <w:tcW w:w="906" w:type="dxa"/>
+            <w:tcW w:w="860" w:type="dxa"/>
             <w:tcBorders>
               <w:top w:val="nil"/>
               <w:left w:val="nil"/>
@@ -17188,7 +17188,7 @@
         </w:tc>
         <w:tc>
           <w:tcPr>
-            <w:tcW w:w="3525" w:type="dxa"/>
+            <w:tcW w:w="3213" w:type="dxa"/>
             <w:tcBorders>
               <w:top w:val="nil"/>
               <w:left w:val="nil"/>
@@ -17228,7 +17228,7 @@
         </w:trPr>
         <w:tc>
           <w:tcPr>
-            <w:tcW w:w="323" w:type="dxa"/>
+            <w:tcW w:w="440" w:type="dxa"/>
             <w:tcBorders>
               <w:top w:val="nil"/>
               <w:left w:val="single" w:sz="4" w:space="0" w:color="auto"/>
@@ -17264,7 +17264,7 @@
         </w:tc>
         <w:tc>
           <w:tcPr>
-            <w:tcW w:w="1860" w:type="dxa"/>
+            <w:tcW w:w="1766" w:type="dxa"/>
             <w:tcBorders>
               <w:top w:val="nil"/>
               <w:left w:val="nil"/>
@@ -17299,7 +17299,7 @@
         </w:tc>
         <w:tc>
           <w:tcPr>
-            <w:tcW w:w="1320" w:type="dxa"/>
+            <w:tcW w:w="1253" w:type="dxa"/>
             <w:tcBorders>
               <w:top w:val="nil"/>
               <w:left w:val="nil"/>
@@ -17335,7 +17335,7 @@
         </w:tc>
         <w:tc>
           <w:tcPr>
-            <w:tcW w:w="1125" w:type="dxa"/>
+            <w:tcW w:w="1068" w:type="dxa"/>
             <w:tcBorders>
               <w:top w:val="nil"/>
               <w:left w:val="nil"/>
@@ -17371,7 +17371,7 @@
         </w:tc>
         <w:tc>
           <w:tcPr>
-            <w:tcW w:w="795" w:type="dxa"/>
+            <w:tcW w:w="755" w:type="dxa"/>
             <w:tcBorders>
               <w:top w:val="nil"/>
               <w:left w:val="nil"/>
@@ -17407,7 +17407,7 @@
         </w:tc>
         <w:tc>
           <w:tcPr>
-            <w:tcW w:w="906" w:type="dxa"/>
+            <w:tcW w:w="860" w:type="dxa"/>
             <w:tcBorders>
               <w:top w:val="nil"/>
               <w:left w:val="nil"/>
@@ -17443,7 +17443,7 @@
         </w:tc>
         <w:tc>
           <w:tcPr>
-            <w:tcW w:w="3525" w:type="dxa"/>
+            <w:tcW w:w="3213" w:type="dxa"/>
             <w:tcBorders>
               <w:top w:val="nil"/>
               <w:left w:val="nil"/>
@@ -17483,7 +17483,7 @@
         </w:trPr>
         <w:tc>
           <w:tcPr>
-            <w:tcW w:w="323" w:type="dxa"/>
+            <w:tcW w:w="440" w:type="dxa"/>
             <w:tcBorders>
               <w:top w:val="nil"/>
               <w:left w:val="single" w:sz="4" w:space="0" w:color="auto"/>
@@ -17519,7 +17519,7 @@
         </w:tc>
         <w:tc>
           <w:tcPr>
-            <w:tcW w:w="1860" w:type="dxa"/>
+            <w:tcW w:w="1766" w:type="dxa"/>
             <w:tcBorders>
               <w:top w:val="nil"/>
               <w:left w:val="nil"/>
@@ -17554,7 +17554,7 @@
         </w:tc>
         <w:tc>
           <w:tcPr>
-            <w:tcW w:w="1320" w:type="dxa"/>
+            <w:tcW w:w="1253" w:type="dxa"/>
             <w:tcBorders>
               <w:top w:val="nil"/>
               <w:left w:val="nil"/>
@@ -17590,7 +17590,7 @@
         </w:tc>
         <w:tc>
           <w:tcPr>
-            <w:tcW w:w="1125" w:type="dxa"/>
+            <w:tcW w:w="1068" w:type="dxa"/>
             <w:tcBorders>
               <w:top w:val="nil"/>
               <w:left w:val="nil"/>
@@ -17626,7 +17626,7 @@
         </w:tc>
         <w:tc>
           <w:tcPr>
-            <w:tcW w:w="795" w:type="dxa"/>
+            <w:tcW w:w="755" w:type="dxa"/>
             <w:tcBorders>
               <w:top w:val="nil"/>
               <w:left w:val="nil"/>
@@ -17662,7 +17662,7 @@
         </w:tc>
         <w:tc>
           <w:tcPr>
-            <w:tcW w:w="906" w:type="dxa"/>
+            <w:tcW w:w="860" w:type="dxa"/>
             <w:tcBorders>
               <w:top w:val="nil"/>
               <w:left w:val="nil"/>
@@ -17698,7 +17698,7 @@
         </w:tc>
         <w:tc>
           <w:tcPr>
-            <w:tcW w:w="3525" w:type="dxa"/>
+            <w:tcW w:w="3213" w:type="dxa"/>
             <w:tcBorders>
               <w:top w:val="nil"/>
               <w:left w:val="nil"/>
@@ -17765,7 +17765,7 @@
         </w:trPr>
         <w:tc>
           <w:tcPr>
-            <w:tcW w:w="323" w:type="dxa"/>
+            <w:tcW w:w="440" w:type="dxa"/>
             <w:tcBorders>
               <w:top w:val="nil"/>
               <w:left w:val="single" w:sz="4" w:space="0" w:color="auto"/>
@@ -17801,7 +17801,7 @@
         </w:tc>
         <w:tc>
           <w:tcPr>
-            <w:tcW w:w="1860" w:type="dxa"/>
+            <w:tcW w:w="1766" w:type="dxa"/>
             <w:tcBorders>
               <w:top w:val="nil"/>
               <w:left w:val="nil"/>
@@ -17836,7 +17836,7 @@
         </w:tc>
         <w:tc>
           <w:tcPr>
-            <w:tcW w:w="1320" w:type="dxa"/>
+            <w:tcW w:w="1253" w:type="dxa"/>
             <w:tcBorders>
               <w:top w:val="nil"/>
               <w:left w:val="nil"/>
@@ -17872,7 +17872,7 @@
         </w:tc>
         <w:tc>
           <w:tcPr>
-            <w:tcW w:w="1125" w:type="dxa"/>
+            <w:tcW w:w="1068" w:type="dxa"/>
             <w:tcBorders>
               <w:top w:val="nil"/>
               <w:left w:val="nil"/>
@@ -17908,7 +17908,7 @@
         </w:tc>
         <w:tc>
           <w:tcPr>
-            <w:tcW w:w="795" w:type="dxa"/>
+            <w:tcW w:w="755" w:type="dxa"/>
             <w:tcBorders>
               <w:top w:val="nil"/>
               <w:left w:val="nil"/>
@@ -17944,7 +17944,7 @@
         </w:tc>
         <w:tc>
           <w:tcPr>
-            <w:tcW w:w="906" w:type="dxa"/>
+            <w:tcW w:w="860" w:type="dxa"/>
             <w:tcBorders>
               <w:top w:val="nil"/>
               <w:left w:val="nil"/>
@@ -17980,7 +17980,7 @@
         </w:tc>
         <w:tc>
           <w:tcPr>
-            <w:tcW w:w="3525" w:type="dxa"/>
+            <w:tcW w:w="3213" w:type="dxa"/>
             <w:tcBorders>
               <w:top w:val="nil"/>
               <w:left w:val="nil"/>
@@ -18020,7 +18020,7 @@
         </w:trPr>
         <w:tc>
           <w:tcPr>
-            <w:tcW w:w="323" w:type="dxa"/>
+            <w:tcW w:w="440" w:type="dxa"/>
             <w:tcBorders>
               <w:top w:val="nil"/>
               <w:left w:val="single" w:sz="4" w:space="0" w:color="auto"/>
@@ -18056,7 +18056,7 @@
         </w:tc>
         <w:tc>
           <w:tcPr>
-            <w:tcW w:w="1860" w:type="dxa"/>
+            <w:tcW w:w="1766" w:type="dxa"/>
             <w:tcBorders>
               <w:top w:val="nil"/>
               <w:left w:val="nil"/>
@@ -18091,7 +18091,7 @@
         </w:tc>
         <w:tc>
           <w:tcPr>
-            <w:tcW w:w="1320" w:type="dxa"/>
+            <w:tcW w:w="1253" w:type="dxa"/>
             <w:tcBorders>
               <w:top w:val="nil"/>
               <w:left w:val="nil"/>
@@ -18127,7 +18127,7 @@
         </w:tc>
         <w:tc>
           <w:tcPr>
-            <w:tcW w:w="1125" w:type="dxa"/>
+            <w:tcW w:w="1068" w:type="dxa"/>
             <w:tcBorders>
               <w:top w:val="nil"/>
               <w:left w:val="nil"/>
@@ -18163,7 +18163,7 @@
         </w:tc>
         <w:tc>
           <w:tcPr>
-            <w:tcW w:w="795" w:type="dxa"/>
+            <w:tcW w:w="755" w:type="dxa"/>
             <w:tcBorders>
               <w:top w:val="nil"/>
               <w:left w:val="nil"/>
@@ -18199,7 +18199,7 @@
         </w:tc>
         <w:tc>
           <w:tcPr>
-            <w:tcW w:w="906" w:type="dxa"/>
+            <w:tcW w:w="860" w:type="dxa"/>
             <w:tcBorders>
               <w:top w:val="nil"/>
               <w:left w:val="nil"/>
@@ -18235,7 +18235,7 @@
         </w:tc>
         <w:tc>
           <w:tcPr>
-            <w:tcW w:w="3525" w:type="dxa"/>
+            <w:tcW w:w="3213" w:type="dxa"/>
             <w:tcBorders>
               <w:top w:val="nil"/>
               <w:left w:val="nil"/>
@@ -18289,7 +18289,7 @@
         </w:trPr>
         <w:tc>
           <w:tcPr>
-            <w:tcW w:w="323" w:type="dxa"/>
+            <w:tcW w:w="440" w:type="dxa"/>
             <w:tcBorders>
               <w:top w:val="nil"/>
               <w:left w:val="single" w:sz="4" w:space="0" w:color="auto"/>
@@ -18325,7 +18325,7 @@
         </w:tc>
         <w:tc>
           <w:tcPr>
-            <w:tcW w:w="1860" w:type="dxa"/>
+            <w:tcW w:w="1766" w:type="dxa"/>
             <w:tcBorders>
               <w:top w:val="nil"/>
               <w:left w:val="nil"/>
@@ -18360,7 +18360,7 @@
         </w:tc>
         <w:tc>
           <w:tcPr>
-            <w:tcW w:w="1320" w:type="dxa"/>
+            <w:tcW w:w="1253" w:type="dxa"/>
             <w:tcBorders>
               <w:top w:val="nil"/>
               <w:left w:val="nil"/>
@@ -18396,7 +18396,7 @@
         </w:tc>
         <w:tc>
           <w:tcPr>
-            <w:tcW w:w="1125" w:type="dxa"/>
+            <w:tcW w:w="1068" w:type="dxa"/>
             <w:tcBorders>
               <w:top w:val="nil"/>
               <w:left w:val="nil"/>
@@ -18432,7 +18432,7 @@
         </w:tc>
         <w:tc>
           <w:tcPr>
-            <w:tcW w:w="795" w:type="dxa"/>
+            <w:tcW w:w="755" w:type="dxa"/>
             <w:tcBorders>
               <w:top w:val="nil"/>
               <w:left w:val="nil"/>
@@ -18468,7 +18468,7 @@
         </w:tc>
         <w:tc>
           <w:tcPr>
-            <w:tcW w:w="906" w:type="dxa"/>
+            <w:tcW w:w="860" w:type="dxa"/>
             <w:tcBorders>
               <w:top w:val="nil"/>
               <w:left w:val="nil"/>
@@ -18504,7 +18504,7 @@
         </w:tc>
         <w:tc>
           <w:tcPr>
-            <w:tcW w:w="3525" w:type="dxa"/>
+            <w:tcW w:w="3213" w:type="dxa"/>
             <w:tcBorders>
               <w:top w:val="nil"/>
               <w:left w:val="nil"/>
@@ -18544,7 +18544,7 @@
         </w:trPr>
         <w:tc>
           <w:tcPr>
-            <w:tcW w:w="323" w:type="dxa"/>
+            <w:tcW w:w="440" w:type="dxa"/>
             <w:tcBorders>
               <w:top w:val="nil"/>
               <w:left w:val="single" w:sz="4" w:space="0" w:color="auto"/>
@@ -18580,7 +18580,7 @@
         </w:tc>
         <w:tc>
           <w:tcPr>
-            <w:tcW w:w="1860" w:type="dxa"/>
+            <w:tcW w:w="1766" w:type="dxa"/>
             <w:tcBorders>
               <w:top w:val="nil"/>
               <w:left w:val="nil"/>
@@ -18615,7 +18615,7 @@
         </w:tc>
         <w:tc>
           <w:tcPr>
-            <w:tcW w:w="1320" w:type="dxa"/>
+            <w:tcW w:w="1253" w:type="dxa"/>
             <w:tcBorders>
               <w:top w:val="nil"/>
               <w:left w:val="nil"/>
@@ -18650,7 +18650,7 @@
         </w:tc>
         <w:tc>
           <w:tcPr>
-            <w:tcW w:w="1125" w:type="dxa"/>
+            <w:tcW w:w="1068" w:type="dxa"/>
             <w:tcBorders>
               <w:top w:val="nil"/>
               <w:left w:val="nil"/>
@@ -18686,7 +18686,7 @@
         </w:tc>
         <w:tc>
           <w:tcPr>
-            <w:tcW w:w="795" w:type="dxa"/>
+            <w:tcW w:w="755" w:type="dxa"/>
             <w:tcBorders>
               <w:top w:val="nil"/>
               <w:left w:val="nil"/>
@@ -18722,7 +18722,7 @@
         </w:tc>
         <w:tc>
           <w:tcPr>
-            <w:tcW w:w="906" w:type="dxa"/>
+            <w:tcW w:w="860" w:type="dxa"/>
             <w:tcBorders>
               <w:top w:val="nil"/>
               <w:left w:val="nil"/>
@@ -18758,7 +18758,7 @@
         </w:tc>
         <w:tc>
           <w:tcPr>
-            <w:tcW w:w="3525" w:type="dxa"/>
+            <w:tcW w:w="3213" w:type="dxa"/>
             <w:tcBorders>
               <w:top w:val="nil"/>
               <w:left w:val="nil"/>
@@ -18798,7 +18798,7 @@
         </w:trPr>
         <w:tc>
           <w:tcPr>
-            <w:tcW w:w="323" w:type="dxa"/>
+            <w:tcW w:w="440" w:type="dxa"/>
             <w:tcBorders>
               <w:top w:val="nil"/>
               <w:left w:val="single" w:sz="4" w:space="0" w:color="auto"/>
@@ -18834,7 +18834,7 @@
         </w:tc>
         <w:tc>
           <w:tcPr>
-            <w:tcW w:w="1860" w:type="dxa"/>
+            <w:tcW w:w="1766" w:type="dxa"/>
             <w:tcBorders>
               <w:top w:val="nil"/>
               <w:left w:val="nil"/>
@@ -18869,7 +18869,7 @@
         </w:tc>
         <w:tc>
           <w:tcPr>
-            <w:tcW w:w="1320" w:type="dxa"/>
+            <w:tcW w:w="1253" w:type="dxa"/>
             <w:tcBorders>
               <w:top w:val="nil"/>
               <w:left w:val="nil"/>
@@ -18904,7 +18904,7 @@
         </w:tc>
         <w:tc>
           <w:tcPr>
-            <w:tcW w:w="1125" w:type="dxa"/>
+            <w:tcW w:w="1068" w:type="dxa"/>
             <w:tcBorders>
               <w:top w:val="nil"/>
               <w:left w:val="nil"/>
@@ -18940,7 +18940,7 @@
         </w:tc>
         <w:tc>
           <w:tcPr>
-            <w:tcW w:w="795" w:type="dxa"/>
+            <w:tcW w:w="755" w:type="dxa"/>
             <w:tcBorders>
               <w:top w:val="nil"/>
               <w:left w:val="nil"/>
@@ -18976,7 +18976,7 @@
         </w:tc>
         <w:tc>
           <w:tcPr>
-            <w:tcW w:w="906" w:type="dxa"/>
+            <w:tcW w:w="860" w:type="dxa"/>
             <w:tcBorders>
               <w:top w:val="nil"/>
               <w:left w:val="nil"/>
@@ -19012,7 +19012,7 @@
         </w:tc>
         <w:tc>
           <w:tcPr>
-            <w:tcW w:w="3525" w:type="dxa"/>
+            <w:tcW w:w="3213" w:type="dxa"/>
             <w:tcBorders>
               <w:top w:val="nil"/>
               <w:left w:val="nil"/>
@@ -19102,7 +19102,7 @@
         </w:trPr>
         <w:tc>
           <w:tcPr>
-            <w:tcW w:w="323" w:type="dxa"/>
+            <w:tcW w:w="440" w:type="dxa"/>
             <w:tcBorders>
               <w:top w:val="nil"/>
               <w:left w:val="single" w:sz="4" w:space="0" w:color="auto"/>
@@ -19138,7 +19138,7 @@
         </w:tc>
         <w:tc>
           <w:tcPr>
-            <w:tcW w:w="1860" w:type="dxa"/>
+            <w:tcW w:w="1766" w:type="dxa"/>
             <w:tcBorders>
               <w:top w:val="nil"/>
               <w:left w:val="nil"/>
@@ -19173,7 +19173,7 @@
         </w:tc>
         <w:tc>
           <w:tcPr>
-            <w:tcW w:w="1320" w:type="dxa"/>
+            <w:tcW w:w="1253" w:type="dxa"/>
             <w:tcBorders>
               <w:top w:val="nil"/>
               <w:left w:val="nil"/>
@@ -19208,7 +19208,7 @@
         </w:tc>
         <w:tc>
           <w:tcPr>
-            <w:tcW w:w="1125" w:type="dxa"/>
+            <w:tcW w:w="1068" w:type="dxa"/>
             <w:tcBorders>
               <w:top w:val="nil"/>
               <w:left w:val="nil"/>
@@ -19244,7 +19244,7 @@
         </w:tc>
         <w:tc>
           <w:tcPr>
-            <w:tcW w:w="795" w:type="dxa"/>
+            <w:tcW w:w="755" w:type="dxa"/>
             <w:tcBorders>
               <w:top w:val="nil"/>
               <w:left w:val="nil"/>
@@ -19280,7 +19280,7 @@
         </w:tc>
         <w:tc>
           <w:tcPr>
-            <w:tcW w:w="906" w:type="dxa"/>
+            <w:tcW w:w="860" w:type="dxa"/>
             <w:tcBorders>
               <w:top w:val="nil"/>
               <w:left w:val="nil"/>
@@ -19316,7 +19316,7 @@
         </w:tc>
         <w:tc>
           <w:tcPr>
-            <w:tcW w:w="3525" w:type="dxa"/>
+            <w:tcW w:w="3213" w:type="dxa"/>
             <w:tcBorders>
               <w:top w:val="nil"/>
               <w:left w:val="nil"/>
@@ -19356,7 +19356,7 @@
         </w:trPr>
         <w:tc>
           <w:tcPr>
-            <w:tcW w:w="323" w:type="dxa"/>
+            <w:tcW w:w="440" w:type="dxa"/>
             <w:tcBorders>
               <w:top w:val="nil"/>
               <w:left w:val="single" w:sz="4" w:space="0" w:color="auto"/>
@@ -19392,7 +19392,7 @@
         </w:tc>
         <w:tc>
           <w:tcPr>
-            <w:tcW w:w="1860" w:type="dxa"/>
+            <w:tcW w:w="1766" w:type="dxa"/>
             <w:tcBorders>
               <w:top w:val="nil"/>
               <w:left w:val="nil"/>
@@ -19427,7 +19427,7 @@
         </w:tc>
         <w:tc>
           <w:tcPr>
-            <w:tcW w:w="1320" w:type="dxa"/>
+            <w:tcW w:w="1253" w:type="dxa"/>
             <w:tcBorders>
               <w:top w:val="nil"/>
               <w:left w:val="nil"/>
@@ -19462,7 +19462,7 @@
         </w:tc>
         <w:tc>
           <w:tcPr>
-            <w:tcW w:w="1125" w:type="dxa"/>
+            <w:tcW w:w="1068" w:type="dxa"/>
             <w:tcBorders>
               <w:top w:val="nil"/>
               <w:left w:val="nil"/>
@@ -19498,7 +19498,7 @@
         </w:tc>
         <w:tc>
           <w:tcPr>
-            <w:tcW w:w="795" w:type="dxa"/>
+            <w:tcW w:w="755" w:type="dxa"/>
             <w:tcBorders>
               <w:top w:val="nil"/>
               <w:left w:val="nil"/>
@@ -19534,7 +19534,7 @@
         </w:tc>
         <w:tc>
           <w:tcPr>
-            <w:tcW w:w="906" w:type="dxa"/>
+            <w:tcW w:w="860" w:type="dxa"/>
             <w:tcBorders>
               <w:top w:val="nil"/>
               <w:left w:val="nil"/>
@@ -19570,7 +19570,7 @@
         </w:tc>
         <w:tc>
           <w:tcPr>
-            <w:tcW w:w="3525" w:type="dxa"/>
+            <w:tcW w:w="3213" w:type="dxa"/>
             <w:tcBorders>
               <w:top w:val="nil"/>
               <w:left w:val="nil"/>
@@ -19610,7 +19610,7 @@
         </w:trPr>
         <w:tc>
           <w:tcPr>
-            <w:tcW w:w="323" w:type="dxa"/>
+            <w:tcW w:w="440" w:type="dxa"/>
             <w:tcBorders>
               <w:top w:val="nil"/>
               <w:left w:val="single" w:sz="4" w:space="0" w:color="auto"/>
@@ -19646,7 +19646,7 @@
         </w:tc>
         <w:tc>
           <w:tcPr>
-            <w:tcW w:w="1860" w:type="dxa"/>
+            <w:tcW w:w="1766" w:type="dxa"/>
             <w:tcBorders>
               <w:top w:val="nil"/>
               <w:left w:val="nil"/>
@@ -19681,7 +19681,7 @@
         </w:tc>
         <w:tc>
           <w:tcPr>
-            <w:tcW w:w="1320" w:type="dxa"/>
+            <w:tcW w:w="1253" w:type="dxa"/>
             <w:tcBorders>
               <w:top w:val="nil"/>
               <w:left w:val="nil"/>
@@ -19716,7 +19716,7 @@
         </w:tc>
         <w:tc>
           <w:tcPr>
-            <w:tcW w:w="1125" w:type="dxa"/>
+            <w:tcW w:w="1068" w:type="dxa"/>
             <w:tcBorders>
               <w:top w:val="nil"/>
               <w:left w:val="nil"/>
@@ -19752,7 +19752,7 @@
         </w:tc>
         <w:tc>
           <w:tcPr>
-            <w:tcW w:w="795" w:type="dxa"/>
+            <w:tcW w:w="755" w:type="dxa"/>
             <w:tcBorders>
               <w:top w:val="nil"/>
               <w:left w:val="nil"/>
@@ -19788,7 +19788,7 @@
         </w:tc>
         <w:tc>
           <w:tcPr>
-            <w:tcW w:w="906" w:type="dxa"/>
+            <w:tcW w:w="860" w:type="dxa"/>
             <w:tcBorders>
               <w:top w:val="nil"/>
               <w:left w:val="nil"/>
@@ -19824,7 +19824,7 @@
         </w:tc>
         <w:tc>
           <w:tcPr>
-            <w:tcW w:w="3525" w:type="dxa"/>
+            <w:tcW w:w="3213" w:type="dxa"/>
             <w:tcBorders>
               <w:top w:val="nil"/>
               <w:left w:val="nil"/>
@@ -19864,7 +19864,7 @@
         </w:trPr>
         <w:tc>
           <w:tcPr>
-            <w:tcW w:w="323" w:type="dxa"/>
+            <w:tcW w:w="440" w:type="dxa"/>
             <w:tcBorders>
               <w:top w:val="nil"/>
               <w:left w:val="single" w:sz="4" w:space="0" w:color="auto"/>
@@ -19900,7 +19900,7 @@
         </w:tc>
         <w:tc>
           <w:tcPr>
-            <w:tcW w:w="1860" w:type="dxa"/>
+            <w:tcW w:w="1766" w:type="dxa"/>
             <w:tcBorders>
               <w:top w:val="nil"/>
               <w:left w:val="nil"/>
@@ -19935,7 +19935,7 @@
         </w:tc>
         <w:tc>
           <w:tcPr>
-            <w:tcW w:w="1320" w:type="dxa"/>
+            <w:tcW w:w="1253" w:type="dxa"/>
             <w:tcBorders>
               <w:top w:val="nil"/>
               <w:left w:val="nil"/>
@@ -19970,7 +19970,7 @@
         </w:tc>
         <w:tc>
           <w:tcPr>
-            <w:tcW w:w="1125" w:type="dxa"/>
+            <w:tcW w:w="1068" w:type="dxa"/>
             <w:tcBorders>
               <w:top w:val="nil"/>
               <w:left w:val="nil"/>
@@ -20006,7 +20006,7 @@
         </w:tc>
         <w:tc>
           <w:tcPr>
-            <w:tcW w:w="795" w:type="dxa"/>
+            <w:tcW w:w="755" w:type="dxa"/>
             <w:tcBorders>
               <w:top w:val="nil"/>
               <w:left w:val="nil"/>
@@ -20042,7 +20042,7 @@
         </w:tc>
         <w:tc>
           <w:tcPr>
-            <w:tcW w:w="906" w:type="dxa"/>
+            <w:tcW w:w="860" w:type="dxa"/>
             <w:tcBorders>
               <w:top w:val="nil"/>
               <w:left w:val="nil"/>
@@ -20078,7 +20078,7 @@
         </w:tc>
         <w:tc>
           <w:tcPr>
-            <w:tcW w:w="3525" w:type="dxa"/>
+            <w:tcW w:w="3213" w:type="dxa"/>
             <w:tcBorders>
               <w:top w:val="nil"/>
               <w:left w:val="nil"/>
@@ -20118,7 +20118,7 @@
         </w:trPr>
         <w:tc>
           <w:tcPr>
-            <w:tcW w:w="323" w:type="dxa"/>
+            <w:tcW w:w="440" w:type="dxa"/>
             <w:tcBorders>
               <w:top w:val="nil"/>
               <w:left w:val="single" w:sz="4" w:space="0" w:color="auto"/>
@@ -20154,7 +20154,7 @@
         </w:tc>
         <w:tc>
           <w:tcPr>
-            <w:tcW w:w="1860" w:type="dxa"/>
+            <w:tcW w:w="1766" w:type="dxa"/>
             <w:tcBorders>
               <w:top w:val="nil"/>
               <w:left w:val="nil"/>
@@ -20189,7 +20189,7 @@
         </w:tc>
         <w:tc>
           <w:tcPr>
-            <w:tcW w:w="1320" w:type="dxa"/>
+            <w:tcW w:w="1253" w:type="dxa"/>
             <w:tcBorders>
               <w:top w:val="nil"/>
               <w:left w:val="nil"/>
@@ -20224,7 +20224,7 @@
         </w:tc>
         <w:tc>
           <w:tcPr>
-            <w:tcW w:w="1125" w:type="dxa"/>
+            <w:tcW w:w="1068" w:type="dxa"/>
             <w:tcBorders>
               <w:top w:val="nil"/>
               <w:left w:val="nil"/>
@@ -20260,7 +20260,7 @@
         </w:tc>
         <w:tc>
           <w:tcPr>
-            <w:tcW w:w="795" w:type="dxa"/>
+            <w:tcW w:w="755" w:type="dxa"/>
             <w:tcBorders>
               <w:top w:val="nil"/>
               <w:left w:val="nil"/>
@@ -20296,7 +20296,7 @@
         </w:tc>
         <w:tc>
           <w:tcPr>
-            <w:tcW w:w="906" w:type="dxa"/>
+            <w:tcW w:w="860" w:type="dxa"/>
             <w:tcBorders>
               <w:top w:val="nil"/>
               <w:left w:val="nil"/>
@@ -20332,7 +20332,7 @@
         </w:tc>
         <w:tc>
           <w:tcPr>
-            <w:tcW w:w="3525" w:type="dxa"/>
+            <w:tcW w:w="3213" w:type="dxa"/>
             <w:tcBorders>
               <w:top w:val="nil"/>
               <w:left w:val="nil"/>
@@ -20386,7 +20386,7 @@
         </w:trPr>
         <w:tc>
           <w:tcPr>
-            <w:tcW w:w="323" w:type="dxa"/>
+            <w:tcW w:w="440" w:type="dxa"/>
             <w:tcBorders>
               <w:top w:val="nil"/>
               <w:left w:val="single" w:sz="4" w:space="0" w:color="auto"/>
@@ -20422,7 +20422,7 @@
         </w:tc>
         <w:tc>
           <w:tcPr>
-            <w:tcW w:w="1860" w:type="dxa"/>
+            <w:tcW w:w="1766" w:type="dxa"/>
             <w:tcBorders>
               <w:top w:val="nil"/>
               <w:left w:val="nil"/>
@@ -20457,7 +20457,7 @@
         </w:tc>
         <w:tc>
           <w:tcPr>
-            <w:tcW w:w="1320" w:type="dxa"/>
+            <w:tcW w:w="1253" w:type="dxa"/>
             <w:tcBorders>
               <w:top w:val="nil"/>
               <w:left w:val="nil"/>
@@ -20492,7 +20492,7 @@
         </w:tc>
         <w:tc>
           <w:tcPr>
-            <w:tcW w:w="1125" w:type="dxa"/>
+            <w:tcW w:w="1068" w:type="dxa"/>
             <w:tcBorders>
               <w:top w:val="nil"/>
               <w:left w:val="nil"/>
@@ -20528,7 +20528,7 @@
         </w:tc>
         <w:tc>
           <w:tcPr>
-            <w:tcW w:w="795" w:type="dxa"/>
+            <w:tcW w:w="755" w:type="dxa"/>
             <w:tcBorders>
               <w:top w:val="nil"/>
               <w:left w:val="nil"/>
@@ -20564,7 +20564,7 @@
         </w:tc>
         <w:tc>
           <w:tcPr>
-            <w:tcW w:w="906" w:type="dxa"/>
+            <w:tcW w:w="860" w:type="dxa"/>
             <w:tcBorders>
               <w:top w:val="nil"/>
               <w:left w:val="nil"/>
@@ -20600,7 +20600,7 @@
         </w:tc>
         <w:tc>
           <w:tcPr>
-            <w:tcW w:w="3525" w:type="dxa"/>
+            <w:tcW w:w="3213" w:type="dxa"/>
             <w:tcBorders>
               <w:top w:val="nil"/>
               <w:left w:val="nil"/>
@@ -20640,7 +20640,7 @@
         </w:trPr>
         <w:tc>
           <w:tcPr>
-            <w:tcW w:w="323" w:type="dxa"/>
+            <w:tcW w:w="440" w:type="dxa"/>
             <w:tcBorders>
               <w:top w:val="nil"/>
               <w:left w:val="single" w:sz="4" w:space="0" w:color="auto"/>
@@ -20676,7 +20676,7 @@
         </w:tc>
         <w:tc>
           <w:tcPr>
-            <w:tcW w:w="1860" w:type="dxa"/>
+            <w:tcW w:w="1766" w:type="dxa"/>
             <w:tcBorders>
               <w:top w:val="nil"/>
               <w:left w:val="nil"/>
@@ -20711,7 +20711,7 @@
         </w:tc>
         <w:tc>
           <w:tcPr>
-            <w:tcW w:w="1320" w:type="dxa"/>
+            <w:tcW w:w="1253" w:type="dxa"/>
             <w:tcBorders>
               <w:top w:val="nil"/>
               <w:left w:val="nil"/>
@@ -20746,7 +20746,7 @@
         </w:tc>
         <w:tc>
           <w:tcPr>
-            <w:tcW w:w="1125" w:type="dxa"/>
+            <w:tcW w:w="1068" w:type="dxa"/>
             <w:tcBorders>
               <w:top w:val="nil"/>
               <w:left w:val="nil"/>
@@ -20782,7 +20782,7 @@
         </w:tc>
         <w:tc>
           <w:tcPr>
-            <w:tcW w:w="795" w:type="dxa"/>
+            <w:tcW w:w="755" w:type="dxa"/>
             <w:tcBorders>
               <w:top w:val="nil"/>
               <w:left w:val="nil"/>
@@ -20818,7 +20818,7 @@
         </w:tc>
         <w:tc>
           <w:tcPr>
-            <w:tcW w:w="906" w:type="dxa"/>
+            <w:tcW w:w="860" w:type="dxa"/>
             <w:tcBorders>
               <w:top w:val="nil"/>
               <w:left w:val="nil"/>
@@ -20854,7 +20854,7 @@
         </w:tc>
         <w:tc>
           <w:tcPr>
-            <w:tcW w:w="3525" w:type="dxa"/>
+            <w:tcW w:w="3213" w:type="dxa"/>
             <w:tcBorders>
               <w:top w:val="nil"/>
               <w:left w:val="nil"/>
@@ -21201,7 +21201,7 @@
         </w:trPr>
         <w:tc>
           <w:tcPr>
-            <w:tcW w:w="323" w:type="dxa"/>
+            <w:tcW w:w="440" w:type="dxa"/>
             <w:tcBorders>
               <w:top w:val="nil"/>
               <w:left w:val="single" w:sz="4" w:space="0" w:color="auto"/>
@@ -21237,7 +21237,7 @@
         </w:tc>
         <w:tc>
           <w:tcPr>
-            <w:tcW w:w="1860" w:type="dxa"/>
+            <w:tcW w:w="1766" w:type="dxa"/>
             <w:tcBorders>
               <w:top w:val="nil"/>
               <w:left w:val="nil"/>
@@ -21272,7 +21272,7 @@
         </w:tc>
         <w:tc>
           <w:tcPr>
-            <w:tcW w:w="1320" w:type="dxa"/>
+            <w:tcW w:w="1253" w:type="dxa"/>
             <w:tcBorders>
               <w:top w:val="nil"/>
               <w:left w:val="nil"/>
@@ -21307,7 +21307,7 @@
         </w:tc>
         <w:tc>
           <w:tcPr>
-            <w:tcW w:w="1125" w:type="dxa"/>
+            <w:tcW w:w="1068" w:type="dxa"/>
             <w:tcBorders>
               <w:top w:val="nil"/>
               <w:left w:val="nil"/>
@@ -21343,7 +21343,7 @@
         </w:tc>
         <w:tc>
           <w:tcPr>
-            <w:tcW w:w="795" w:type="dxa"/>
+            <w:tcW w:w="755" w:type="dxa"/>
             <w:tcBorders>
               <w:top w:val="nil"/>
               <w:left w:val="nil"/>
@@ -21379,7 +21379,7 @@
         </w:tc>
         <w:tc>
           <w:tcPr>
-            <w:tcW w:w="906" w:type="dxa"/>
+            <w:tcW w:w="860" w:type="dxa"/>
             <w:tcBorders>
               <w:top w:val="nil"/>
               <w:left w:val="nil"/>
@@ -21415,7 +21415,7 @@
         </w:tc>
         <w:tc>
           <w:tcPr>
-            <w:tcW w:w="3525" w:type="dxa"/>
+            <w:tcW w:w="3213" w:type="dxa"/>
             <w:tcBorders>
               <w:top w:val="nil"/>
               <w:left w:val="nil"/>

</xml_diff>

<commit_message>
Rehacer respuestas VALO con el ejemplo Excel de valor descontado
Co-Authored-By: Claude Opus 5.5 <noreply@anthropic.com>
Claude-Session: https://claude.ai/code/session_01WxCVvi9WUJZoa4dYVmts3j
</commit_message>
<xml_diff>
--- a/respuestas_VALO/Diseño Archivo Créditos VALO - RESPONDIDO.docx
+++ b/respuestas_VALO/Diseño Archivo Créditos VALO - RESPONDIDO.docx
@@ -2079,7 +2079,7 @@
                 <w:szCs w:val="18"/>
                 <w:lang w:val="es-AR"/>
               </w:rPr>
-              <w:t xml:space="preserve">Es el valor presente de cada cuota cedida, descontada a la Tasa de Descuento (TD) a la fecha de cálculo. No es un dato del sistema: se calcula cuota por cuota con la fórmula del campo 25 del Registro Detalle (ver respuesta en ese campo). La TD y la fecha de cálculo las informa el Banco en cada lote.</w:t>
+              <w:t xml:space="preserve">Es el valor presente de cada cuota cedida, descontada a la Tasa de Descuento (TD) a la fecha de liquidación. Se descuentan el capital y el interés de la cuota (CAP + INTADEV); el IVA no se descuenta. No es un dato del sistema: se calcula cuota por cuota con la fórmula del campo 25 del Registro Detalle (ver respuesta en ese campo). La TD y la fecha de liquidación las informa el Banco en cada lote.</w:t>
             </w:r>
           </w:p>
         </w:tc>
@@ -2246,7 +2246,7 @@
                 <w:szCs w:val="18"/>
                 <w:lang w:val="es-AR"/>
               </w:rPr>
-              <w:t xml:space="preserve">Es la diferencia entre el valor nominal de la cuota y su valor descontado: Interés a Descuento = Importe de cuota − Valor Descontado. En el archivo de Créditos se informa la suma de todas las cuotas cedidas del crédito.</w:t>
+              <w:t xml:space="preserve">Es la diferencia entre el valor nominal (capital + interés) de la cuota y su valor descontado: Interés a Descuento = CAP + INTADEV − Valor Descontado. En el archivo de Créditos se informa la suma de todas las cuotas cedidas del crédito.</w:t>
             </w:r>
           </w:p>
         </w:tc>
@@ -2504,7 +2504,23 @@
           <w:szCs w:val="18"/>
           <w:lang w:val="es-AR"/>
         </w:rPr>
-        <w:t xml:space="preserve">Ese orden se respeta en la Cabecera y en el Detalle de los archivos de Créditos y de Cuotas. IVAINT se informa aunque su valor sea 0.00. INTDEVNOVENC no se informa.</w:t>
+        <w:t xml:space="preserve">Ese orden se respeta en la Cabecera y en el Detalle de los archivos de Créditos y de Cuotas. INTDEVNOVENC no se informa.</w:t>
+      </w:r>
+    </w:p>
+    <w:p>
+      <w:pPr>
+        <w:spacing w:before="60" w:after="0"/>
+        <w:ind w:left="0" w:firstLine="0"/>
+      </w:pPr>
+      <w:r>
+        <w:rPr>
+          <w:rFonts w:ascii="Calibri" w:hAnsi="Calibri" w:cs="Calibri"/>
+          <w:color w:val="1F4E79"/>
+          <w:sz w:val="18"/>
+          <w:szCs w:val="18"/>
+          <w:lang w:val="es-AR"/>
+        </w:rPr>
+        <w:t xml:space="preserve">La TD es una tasa efectiva anual (TEA). En el ejemplo adjunto se parte de una tasa nominal anual de descuento del 47%: TEA = (1 + 0.47 × 30/365)^(365/30) − 1 = 58.59%.</w:t>
       </w:r>
     </w:p>
     <w:p>
@@ -11851,7 +11867,7 @@
                 <w:szCs w:val="18"/>
                 <w:lang w:val="es-AR"/>
               </w:rPr>
-              <w:t xml:space="preserve">Ejemplo de cabecera de otra cartera del mismo tipo (TD 57.83 al final):</w:t>
+              <w:t xml:space="preserve">Ejemplo de cabecera (ver Excel adjunto; la TD 58.59 va al final):</w:t>
             </w:r>
           </w:p>
           <w:p>
@@ -11867,7 +11883,7 @@
                 <w:szCs w:val="18"/>
                 <w:lang w:val="es-AR"/>
               </w:rPr>
-              <w:t xml:space="preserve">CREDITOS,ALTA,1,530,202609,18,18,198,6114,30642899593,528020000.00,1138518967.28,0.00,853612767.37,812926199.91,57.83</w:t>
+              <w:t xml:space="preserve">CREDITOS,ALTA,1,1,202608,1,1,198,9999,30000000000,875000.00,480982.26,101006.26,1078989.10,276993.16,58.59</w:t>
             </w:r>
           </w:p>
         </w:tc>
@@ -12200,7 +12216,7 @@
                 <w:szCs w:val="18"/>
                 <w:lang w:val="es-AR"/>
               </w:rPr>
-              <w:t xml:space="preserve">Es la suma del campo INTERÉS A DESCUENTO (campo 26) de todos los créditos del archivo. Se cumple que Total Valor Descontado + Total Interés a Descuento = Total Saldo de Capital + Total Interés a Devengar (+ IVA, si corresponde).</w:t>
+              <w:t xml:space="preserve">Es la suma del campo INTERÉS A DESCUENTO (campo 26) de todos los créditos del archivo. Se cumple que Total Valor Descontado + Total Interés a Descuento = Total Saldo de Capital + Total Interés a Devengar. En el ejemplo: 1078989.10 + 276993.16 = 875000.00 + 480982.26 = 1355982.26.</w:t>
             </w:r>
           </w:p>
         </w:tc>
@@ -21065,7 +21081,7 @@
                 <w:szCs w:val="18"/>
                 <w:lang w:val="es-AR"/>
               </w:rPr>
-              <w:t xml:space="preserve">Factor = (1 + TD/100) ^ ( −(fecha vto. cuota − fecha de cálculo, en días) / 365 )</w:t>
+              <w:t xml:space="preserve">Factor = (1 + TD/100) ^ ( −(fecha vto. cuota − fecha de liquidación, en días) / 365 )</w:t>
             </w:r>
           </w:p>
           <w:p>
@@ -21081,7 +21097,7 @@
                 <w:szCs w:val="18"/>
                 <w:lang w:val="es-AR"/>
               </w:rPr>
-              <w:t xml:space="preserve">Valor Descontado de la cuota = Importe de cuota × Factor (redondeado a 2 decimales, usando el factor sin redondear)</w:t>
+              <w:t xml:space="preserve">Valor Descontado de la cuota = (CAP + INTADEV de la cuota) × Factor, redondeado a 2 decimales y usando el factor sin redondear. El IVA no se descuenta. En la fórmula del documento, "suma_de_conceptos_cedidos" es CAP + INTADEV.</w:t>
             </w:r>
           </w:p>
           <w:p>
@@ -21097,7 +21113,7 @@
                 <w:szCs w:val="18"/>
                 <w:lang w:val="es-AR"/>
               </w:rPr>
-              <w:t xml:space="preserve">El campo 25 es la suma del Valor Descontado de todas las cuotas cedidas del crédito. Datos necesarios: importe y fecha de vencimiento de cada cuota (del sistema), TD y fecha de cálculo (las informa el Banco).</w:t>
+              <w:t xml:space="preserve">El campo 25 es la suma del Valor Descontado de todas las cuotas cedidas del crédito. Datos necesarios: capital, interés y fecha de vencimiento de cada cuota (del sistema), TD y fecha de liquidación (las informa el Banco).</w:t>
             </w:r>
           </w:p>
           <w:p>
@@ -21113,7 +21129,7 @@
                 <w:szCs w:val="18"/>
                 <w:lang w:val="es-AR"/>
               </w:rPr>
-              <w:t xml:space="preserve">Ejemplo (TD 57.83, fecha de cálculo 24/09/2026), crédito de 36 cuotas de 14718.47:</w:t>
+              <w:t xml:space="preserve">Ejemplo (ver Excel adjunto): TD 58.59, fecha de liquidación 03/08/2026, crédito de 12 cuotas.</w:t>
             </w:r>
           </w:p>
           <w:p>
@@ -21129,7 +21145,7 @@
                 <w:szCs w:val="18"/>
                 <w:lang w:val="es-AR"/>
               </w:rPr>
-              <w:t xml:space="preserve">Cuota 1, vto. 20/12/2026: 87 días → Factor = 1.5783^(−87/365) = 0.896934 → Valor Descontado = 14718.47 × 0.896934 = 13201.49</w:t>
+              <w:t xml:space="preserve">Cuota 1, vto. 20/08/2026: 17 días → Factor = 1.5859^(−17/365) = 0.978751 → Valor Descontado = (43774.04 + 64166.67) × 0.978751 = 105647.05</w:t>
             </w:r>
           </w:p>
           <w:p>
@@ -21145,7 +21161,7 @@
                 <w:szCs w:val="18"/>
                 <w:lang w:val="es-AR"/>
               </w:rPr>
-              <w:t xml:space="preserve">Sumando las 36 cuotas: Valor Descontado = 263727.98 e Interés a Descuento = 266136.94 (Monto cedido 529864.92 = 263727.98 + 266136.94).</w:t>
+              <w:t xml:space="preserve">Sumando las 12 cuotas: Valor Descontado = 1078989.10 e Interés a Descuento = 276993.16. Monto cedido = Capital + Interés = 875000.00 + 480982.26 = 1355982.26 = 1078989.10 + 276993.16.</w:t>
             </w:r>
           </w:p>
           <w:p>
@@ -21161,7 +21177,7 @@
                 <w:szCs w:val="18"/>
                 <w:lang w:val="es-AR"/>
               </w:rPr>
-              <w:t xml:space="preserve">Registro de detalle resultante (datos personales ocultos):</w:t>
+              <w:t xml:space="preserve">Registro de detalle resultante:</w:t>
             </w:r>
           </w:p>
           <w:p>
@@ -21177,7 +21193,7 @@
                 <w:szCs w:val="18"/>
                 <w:lang w:val="es-AR"/>
               </w:rPr>
-              <w:t xml:space="preserve">4100007591,7,23XXXXXXXX4,APELLIDO NOMBRE,160000.00,36,105.00,0,14718.47,100926,201226,201226,36,529864.92,5,160000.00,369864.92,0.00,263727.98,266136.94</w:t>
+              <w:t xml:space="preserve">300026842,7,20100000000,JONATHAN DOMINGUEZ,875000.00,12,106.48,0,121415.71,020626,200826,200826,12,1355982.26,2,875000.00,480982.26,101006.26,1078989.10,276993.16</w:t>
             </w:r>
           </w:p>
           <w:p>

</xml_diff>